<commit_message>
docs(bc3): adopte le plan de l'Exemple 1, développe les missions et le SWOT
Restructure le dossier EEMI selon le plan détaillé de l'Exemple 1 de table
des matières (1. L'entreprise avec présentation/organisation, 2. Les
missions et projets avec missions et responsabilités, interactions,
stratégie de communication, élaboration, les différentes missions détaillées
et retour d'expérience, 3. Conclusion, 4. Bibliographie). Développe fortement
la partie "Les différentes missions" (réseaux, stories et Reels vidéo,
shootings, fiches produits, emailing, reporting) et rend le SWOT explicite
sous l'analyse de l'environnement.

Co-Authored-By: Claude Opus 4.8 <noreply@anthropic.com>
Claude-Session: https://claude.ai/code/session_013XZsCkVv1YrHfxt73dcWQ8
</commit_message>
<xml_diff>
--- a/dossier-bc3/Dossier_BC3_EEMI_Estelle_CASTEROT.docx
+++ b/dossier-bc3/Dossier_BC3_EEMI_Estelle_CASTEROT.docx
@@ -237,7 +237,6 @@
       <w:r>
         <w:t>Retour d'expérience en entreprise</w:t>
       </w:r>
-      <w:r/>
     </w:p>
     <w:p>
       <w:pPr>
@@ -427,7 +426,7 @@
         <w:jc w:val="both"/>
       </w:pPr>
       <w:r>
-        <w:t>J'ai réalisé mon alternance de troisième année de Bachelor Communication, Marketing et Événementiel au sein de la marque J'ai vu la Vierge, selon un rythme de deux semaines en entreprise pour une semaine à l'école. J'y ai occupé le poste de Cheffe de Projet e-commerce, au sein du pôle digital, sous la responsabilité de ma tutrice Camille Abela, Responsable de Projet e-commerce. Mes missions couvraient l'animation des réseaux sociaux, la production de contenus, la rédaction des fiches produits, l'emailing et le reporting des performances.</w:t>
+        <w:t>J'ai réalisé mon alternance de troisième année de Bachelor Communication, Marketing et Événementiel au sein de la marque J'ai vu la Vierge, selon un rythme de deux semaines en entreprise pour une semaine à l'école. J'y ai occupé le poste de Cheffe de Projet e-commerce, au sein du pôle digital, sous la responsabilité de ma tutrice Camille Abela.</w:t>
       </w:r>
     </w:p>
     <w:p>
@@ -435,7 +434,7 @@
         <w:jc w:val="both"/>
       </w:pPr>
       <w:r>
-        <w:t>J'ai choisi cette alternance parce qu'elle correspondait précisément à mon projet professionnel. Je souhaitais apprendre à piloter des projets digitaux de bout en bout et découvrir le e-commerce, un univers que je connaissais peu et qui me semblait porteur. Rejoindre une marque à l'identité aussi singulière que J'ai vu la Vierge représentait un défi stimulant, à la croisée de la communication, du marketing et de l'événementiel, les trois dimensions de ma formation. Cette expérience s'inscrit pleinement dans mon ambition de poursuivre en mastère puis de devenir cheffe de projet.</w:t>
+        <w:t>J'ai choisi cette alternance parce qu'elle correspondait précisément à mon projet professionnel. Je voulais apprendre à piloter des projets digitaux de bout en bout et découvrir le e-commerce, un univers que je connaissais peu et qui me semblait porteur. Rejoindre une marque à l'identité aussi singulière que J'ai vu la Vierge représentait un défi stimulant, à la croisée de la communication, du marketing et de l'événementiel. Cette expérience s'inscrit pleinement dans mon ambition de poursuivre en mastère puis de devenir cheffe de projet.</w:t>
       </w:r>
     </w:p>
     <w:p>
@@ -443,7 +442,7 @@
         <w:jc w:val="both"/>
       </w:pPr>
       <w:r>
-        <w:t>La marque J'ai vu la Vierge réinvente la statuette de la Vierge Marie en objet de décoration contemporain, à la rencontre de l'iconographie religieuse, de l'artisanat et de la culture pop. Ce positionnement fait à la fois sa force et sa principale difficulté de communication, car il faut réussir à proposer un objet à forte charge symbolique à un public large sans jamais trahir son identité. De ce constat est née la problématique qui guide ce dossier.</w:t>
+        <w:t>La marque réinvente la statuette de la Vierge Marie en objet de décoration contemporain, à la rencontre de l'iconographie religieuse, de l'artisanat et de la culture pop. Ce positionnement fait à la fois sa force et sa principale difficulté de communication, car il faut proposer un objet à forte charge symbolique à un public large sans trahir son identité. De ce constat est née la problématique qui guide ce dossier.</w:t>
       </w:r>
     </w:p>
     <w:p>
@@ -463,7 +462,7 @@
         <w:jc w:val="both"/>
       </w:pPr>
       <w:r>
-        <w:t>Pour y répondre, je présente d'abord l'entreprise, son organisation et son environnement technique. J'expose ensuite mon poste et mes missions, avant de consacrer un focus détaillé au projet central de mon alternance, la stratégie de communication digitale de la marque. Je termine par une synthèse et un bilan des compétences et des enseignements que cette expérience m'a apportés.</w:t>
+        <w:t>Pour y répondre, je présente d'abord l'entreprise, son organisation et son environnement. J'expose ensuite mes missions et responsabilités, puis le projet central de mon alternance, la stratégie de communication digitale, avant de détailler l'ensemble de mes missions. Je termine par un retour d'expérience, une synthèse et un bilan.</w:t>
       </w:r>
     </w:p>
     <w:p>
@@ -484,15 +483,23 @@
         <w:pStyle w:val="Heading2"/>
       </w:pPr>
       <w:r>
-        <w:t>1.1 La structure</w:t>
+        <w:t>a. Présentation de l'entreprise</w:t>
       </w:r>
     </w:p>
     <w:p>
       <w:pPr>
+        <w:pStyle w:val="Heading3"/>
+      </w:pPr>
+      <w:r>
+        <w:t>i. Historique et activités</w:t>
+      </w:r>
+    </w:p>
+    <w:p>
+      <w:pPr>
         <w:jc w:val="both"/>
       </w:pPr>
       <w:r>
-        <w:t>J'ai vu la Vierge est une marque de décoration qui revisite une figure très ancienne, la statuette de la Vierge Marie, pour en faire un objet contemporain, coloré et désirable. Là où l'objet religieux classique reste discret et traditionnel, la marque en fait une pièce de décoration assumée, à la fois spirituelle et pop, que l'on affiche chez soi comme un objet de style autant que de sens. Son ambition est de bousculer les codes de la décoration dévote.</w:t>
+        <w:t>J'ai vu la Vierge est une marque de décoration qui revisite une figure très ancienne, la statuette de la Vierge Marie, pour en faire un objet contemporain, coloré et désirable. Là où l'objet religieux classique reste discret, la marque en fait une pièce de décoration assumée, à la fois spirituelle et pop, avec l'ambition de bousculer les codes de la décoration dévote.</w:t>
       </w:r>
     </w:p>
     <w:p>
@@ -508,15 +515,7 @@
         <w:jc w:val="both"/>
       </w:pPr>
       <w:r>
-        <w:t>L'aventure a d'abord été familiale. Alexandra s'occupait de la partie commerciale et démarchait les revendeurs de Marseille et des villages touristiques alentour, Damien assurait le design et la production, et la mère de Damien tenait le poste d'agent de conditionnement. Le concept marseillais a connu un succès rapide, notamment grâce à la participation au salon Maison et Objet, qui a ouvert la marque à l'international. Aujourd'hui, l'entreprise est installée dans le quartier de La Pomme, à Marseille.</w:t>
-      </w:r>
-    </w:p>
-    <w:p>
-      <w:pPr>
-        <w:jc w:val="both"/>
-      </w:pPr>
-      <w:r>
-        <w:t>Sur le plan juridique, J'ai vu la Vierge est une PME au statut de SAS. Quelques chiffres clés résument son développement.</w:t>
+        <w:t>L'aventure a d'abord été familiale. Alexandra s'occupait de la partie commerciale, Damien du design et de la production, et la mère de Damien du conditionnement. Le concept a connu un succès rapide, notamment grâce au salon Maison et Objet, qui a ouvert la marque à l'international. Aujourd'hui, l'entreprise est installée dans le quartier de La Pomme, à Marseille. Quelques chiffres clés résument son développement.</w:t>
       </w:r>
     </w:p>
     <w:p>
@@ -527,10 +526,10 @@
         <w:rPr>
           <w:b/>
         </w:rPr>
-        <w:t xml:space="preserve">Création : </w:t>
+        <w:t xml:space="preserve">Statut : </w:t>
       </w:r>
       <w:r>
-        <w:t>2018, à Marseille.</w:t>
+        <w:t>PME au statut de SAS, créée en 2018 à Marseille.</w:t>
       </w:r>
     </w:p>
     <w:p>
@@ -572,15 +571,23 @@
         <w:t xml:space="preserve">Bascule vers le digital : </w:t>
       </w:r>
       <w:r>
-        <w:t>pendant le confinement (de mars 2020 à mai 2021), les ventes du site e-commerce sont passées de 2 715,85 euros à 34 105,74 euros de chiffre d'affaires net d'une année sur l'autre, ce qui a confirmé l'importance stratégique du canal en ligne.</w:t>
+        <w:t>pendant le confinement, les ventes du site sont passées de 2 715,85 euros à 34 105,74 euros de chiffre d'affaires net d'une année sur l'autre.</w:t>
       </w:r>
     </w:p>
     <w:p>
       <w:pPr>
+        <w:pStyle w:val="Heading3"/>
+      </w:pPr>
+      <w:r>
+        <w:t>ii. Positionnement sur le marché</w:t>
+      </w:r>
+    </w:p>
+    <w:p>
+      <w:pPr>
         <w:jc w:val="both"/>
       </w:pPr>
       <w:r>
-        <w:t>La marque s'adresse à une clientèle majoritairement féminine, avec un cœur de cible situé entre trente et soixante ans, sensible à la décoration, à l'objet qui a du sens et au cadeau original. Pour orienter mes contenus, je me suis appuyée sur un persona type : une femme active et urbaine, attirée par les objets qui racontent une histoire, présente sur Instagram et attachée à l'authenticité d'une marque.</w:t>
+        <w:t>La marque occupe un positionnement premium et affinitaire : on n'achète pas seulement un objet, on adhère à une histoire et à une esthétique. Elle s'adresse à une clientèle majoritairement féminine, avec un cœur de cible situé entre trente et soixante ans. Pour orienter mes contenus, je me suis appuyée sur un persona type : une femme active et urbaine, attirée par les objets qui racontent une histoire, présente sur Instagram et attachée à l'authenticité d'une marque.</w:t>
       </w:r>
     </w:p>
     <w:p>
@@ -597,15 +604,15 @@
         <w:jc w:val="both"/>
       </w:pPr>
       <w:r>
-        <w:t>La distribution repose sur plusieurs canaux complémentaires : le site e-commerce propulsé par Shopify, une plateforme dédiée aux revendeurs sous Odoo, et un réseau de partenaires physiques prestigieux comme Le Printemps, le Mucem, Maison et Objet, Boboboom ou l'Olympique de Marseille, sans oublier des collaborations médiatiques telles que celle menée avec Karine Le Marchand.</w:t>
+        <w:t>La distribution repose sur plusieurs canaux complémentaires : le site e-commerce propulsé par Shopify, une plateforme dédiée aux revendeurs sous Odoo, et un réseau de partenaires physiques prestigieux comme Le Printemps, le Mucem, Maison et Objet, Boboboom ou l'Olympique de Marseille, sans oublier des collaborations médiatiques telles que celle menée avec Karine Le Marchand. Sur son marché, la marque évolue face à des concurrents qui exploitent le même imaginaire, notamment Sapristi et Miraculeuse. Ce qui la distingue tient à deux atouts : une présence sur les réseaux sociaux nettement plus dynamique et un réseau de très bons commerçants et partenaires.</w:t>
       </w:r>
     </w:p>
     <w:p>
       <w:pPr>
-        <w:jc w:val="both"/>
+        <w:pStyle w:val="Heading3"/>
       </w:pPr>
       <w:r>
-        <w:t>Sur son marché, la marque évolue face à des concurrents qui exploitent le même imaginaire, notamment Sapristi et Miraculeuse. Ce qui la distingue tient à deux atouts majeurs : une présence sur les réseaux sociaux nettement plus dynamique et un réseau de très bons commerçants et partenaires qui l'installent dans des lieux reconnus.</w:t>
+        <w:t>iii. Analyse de l'environnement</w:t>
       </w:r>
     </w:p>
     <w:p>
@@ -613,7 +620,13 @@
         <w:jc w:val="both"/>
       </w:pPr>
       <w:r>
-        <w:t>Pour situer ce contexte, j'ai synthétisé l'environnement externe de la marque dans une grille PESTEL, puis l'ensemble de l'analyse dans une matrice SWOT.</w:t>
+        <w:rPr>
+          <w:b/>
+        </w:rPr>
+        <w:t xml:space="preserve">Environnement externe. </w:t>
+      </w:r>
+      <w:r>
+        <w:t>J'ai synthétisé l'environnement externe de la marque dans une grille PESTEL, qui passe en revue les grands facteurs qui influencent son activité.</w:t>
       </w:r>
     </w:p>
     <w:tbl>
@@ -834,7 +847,7 @@
               <w:rPr>
                 <w:sz w:val="20"/>
               </w:rPr>
-              <w:t>Cadre du RGPD pour l'emailing, droit à l'image pour les shootings et obligations du e-commerce.</w:t>
+              <w:t>Cadre du RGPD pour l'emailing et obligations propres au e-commerce.</w:t>
             </w:r>
           </w:p>
         </w:tc>
@@ -853,6 +866,20 @@
       </w:r>
     </w:p>
     <w:p/>
+    <w:p>
+      <w:pPr>
+        <w:jc w:val="both"/>
+      </w:pPr>
+      <w:r>
+        <w:rPr>
+          <w:b/>
+        </w:rPr>
+        <w:t xml:space="preserve">Environnement interne et synthèse SWOT. </w:t>
+      </w:r>
+      <w:r>
+        <w:t>En croisant les forces et faiblesses internes avec les opportunités et menaces externes, j'obtiens la matrice SWOT suivante, qui résume la situation stratégique de la marque.</w:t>
+      </w:r>
+    </w:p>
     <w:tbl>
       <w:tblPr>
         <w:tblStyle w:val="TableGrid"/>
@@ -1032,15 +1059,15 @@
         <w:pStyle w:val="Heading2"/>
       </w:pPr>
       <w:r>
-        <w:t>1.2 L'organisation et les équipes</w:t>
+        <w:t>b. L'organisation et les équipes</w:t>
       </w:r>
     </w:p>
     <w:p>
       <w:pPr>
-        <w:jc w:val="both"/>
+        <w:pStyle w:val="Heading3"/>
       </w:pPr>
       <w:r>
-        <w:t>J'ai vu la Vierge est une structure à taille humaine, aujourd'hui composée de neuf salariés, organisée autour de sa direction et de plusieurs pôles. Le management y est de proximité, dans un esprit encore familial hérité des débuts de la marque, ce qui favorise la réactivité et la circulation de l'information.</w:t>
+        <w:t>i. Organisation de la structure</w:t>
       </w:r>
     </w:p>
     <w:p>
@@ -1048,7 +1075,7 @@
         <w:jc w:val="both"/>
       </w:pPr>
       <w:r>
-        <w:t>L'organisation se répartit en quatre pôles : la direction, portée par Alexandra Cefai et Damien Grauvogel, le pôle digital auquel j'étais rattachée, le pôle commercial et le pôle atelier, où sont réalisées la peinture et la préparation des commandes. L'organigramme ci-dessous situe ma position au sein de cet ensemble.</w:t>
+        <w:t>J'ai vu la Vierge est une structure à taille humaine, aujourd'hui composée de neuf salariés, avec un management de proximité dans un esprit encore familial hérité des débuts de la marque. L'organisation se répartit en quatre pôles : la direction, portée par Alexandra Cefai et Damien Grauvogel, le pôle digital auquel j'étais rattachée, le pôle commercial et le pôle atelier, où sont réalisées la peinture et la préparation des commandes. L'organigramme ci-dessous situe ma position au sein de cet ensemble.</w:t>
       </w:r>
     </w:p>
     <w:p>
@@ -1077,10 +1104,10 @@
     </w:p>
     <w:p>
       <w:pPr>
-        <w:pStyle w:val="Heading2"/>
+        <w:pStyle w:val="Heading3"/>
       </w:pPr>
       <w:r>
-        <w:t>1.3 L'environnement technique</w:t>
+        <w:t>ii. Les différents métiers</w:t>
       </w:r>
     </w:p>
     <w:p>
@@ -1088,108 +1115,7 @@
         <w:jc w:val="both"/>
       </w:pPr>
       <w:r>
-        <w:t>Mon travail s'appuyait sur un ensemble d'outils numériques complémentaires, qui constituent l'environnement technique de la marque.</w:t>
-      </w:r>
-    </w:p>
-    <w:p>
-      <w:pPr>
-        <w:pStyle w:val="ListBullet"/>
-      </w:pPr>
-      <w:r>
-        <w:rPr>
-          <w:b/>
-        </w:rPr>
-        <w:t xml:space="preserve">Shopify : </w:t>
-      </w:r>
-      <w:r>
-        <w:t>gestion du site e-commerce, des fiches produits et des données de vente.</w:t>
-      </w:r>
-    </w:p>
-    <w:p>
-      <w:pPr>
-        <w:pStyle w:val="ListBullet"/>
-      </w:pPr>
-      <w:r>
-        <w:rPr>
-          <w:b/>
-        </w:rPr>
-        <w:t xml:space="preserve">Odoo : </w:t>
-      </w:r>
-      <w:r>
-        <w:t>gestion de la relation et des commandes avec les revendeurs professionnels.</w:t>
-      </w:r>
-    </w:p>
-    <w:p>
-      <w:pPr>
-        <w:pStyle w:val="ListBullet"/>
-      </w:pPr>
-      <w:r>
-        <w:rPr>
-          <w:b/>
-        </w:rPr>
-        <w:t xml:space="preserve">Kiliba : </w:t>
-      </w:r>
-      <w:r>
-        <w:t>solution d'emailing automatisé, pilotée par l'intelligence artificielle et intégrée à Shopify.</w:t>
-      </w:r>
-    </w:p>
-    <w:p>
-      <w:pPr>
-        <w:pStyle w:val="ListBullet"/>
-      </w:pPr>
-      <w:r>
-        <w:rPr>
-          <w:b/>
-        </w:rPr>
-        <w:t xml:space="preserve">Trello : </w:t>
-      </w:r>
-      <w:r>
-        <w:t>planification des tâches et suivi de l'avancement des contenus.</w:t>
-      </w:r>
-    </w:p>
-    <w:p>
-      <w:pPr>
-        <w:pStyle w:val="ListBullet"/>
-      </w:pPr>
-      <w:r>
-        <w:rPr>
-          <w:b/>
-        </w:rPr>
-        <w:t xml:space="preserve">Les outils des plateformes sociales : </w:t>
-      </w:r>
-      <w:r>
-        <w:t>Instagram, TikTok et Facebook, pour la programmation et le suivi des publications.</w:t>
-      </w:r>
-    </w:p>
-    <w:p>
-      <w:pPr>
-        <w:pStyle w:val="ListBullet"/>
-      </w:pPr>
-      <w:r>
-        <w:rPr>
-          <w:b/>
-        </w:rPr>
-        <w:t xml:space="preserve">Un studio d'emailing sur mesure : </w:t>
-      </w:r>
-      <w:r>
-        <w:t>développé pour les communications les plus premium, afin de garantir le respect de l'identité visuelle de la marque.</w:t>
-      </w:r>
-    </w:p>
-    <w:p>
-      <w:r>
-        <w:rPr>
-          <w:i/>
-          <w:highlight w:val="yellow"/>
-        </w:rPr>
-        <w:t>[À compléter : ajoutez vos outils de création de visuels, par exemple Canva ou la suite Adobe]</w:t>
-      </w:r>
-    </w:p>
-    <w:p>
-      <w:pPr>
-        <w:jc w:val="both"/>
-      </w:pPr>
-      <w:r>
-        <w:t>Sur le plan des relations externes, la marque interagit avec ses prestataires, avec ses clients particuliers via le site et les réseaux, et avec son important réseau de revendeurs et de partenaires physiques, dont j'assurais le relais sur les canaux digitaux.</w:t>
+        <w:t>Chaque pôle regroupe des métiers complémentaires. La direction assure la création, le design produit et la stratégie globale. Le pôle commercial gère la relation avec les revendeurs et le développement des ventes professionnelles. Le pôle atelier réalise la production, la peinture et la préparation des commandes. Le pôle digital, enfin, porte l'image de la marque et les ventes en ligne, à travers le site e-commerce, les réseaux sociaux et l'emailing. C'est dans ce dernier pôle que s'inscrivait mon poste.</w:t>
       </w:r>
     </w:p>
     <w:p>
@@ -1210,7 +1136,7 @@
         <w:pStyle w:val="Heading2"/>
       </w:pPr>
       <w:r>
-        <w:t>2.1 Présentation du poste et des missions</w:t>
+        <w:t>a. Missions et responsabilités</w:t>
       </w:r>
     </w:p>
     <w:p>
@@ -1218,7 +1144,127 @@
         <w:jc w:val="both"/>
       </w:pPr>
       <w:r>
-        <w:t>En tant que Cheffe de Projet e-commerce au sein du pôle digital, j'occupais un rôle transversal, entre communication, création de contenu et commerce en ligne. Mes interlocuteurs hiérarchiques étaient ma tutrice Camille Abela, qui me briefait et validait mes contenus, et Alexandra Cefai, la créatrice, pour tout ce qui touchait à l'identité visuelle. Mes missions récurrentes étaient les suivantes.</w:t>
+        <w:t>En tant que Cheffe de Projet e-commerce au sein du pôle digital, j'occupais un rôle transversal, entre communication, création de contenu et commerce en ligne. Mes interlocuteurs hiérarchiques étaient ma tutrice Camille Abela, qui me briefait et validait mes contenus, et Alexandra Cefai, la créatrice, pour tout ce qui touchait à l'identité visuelle. J'avais la responsabilité de faire vivre la marque au quotidien sur ses canaux digitaux, avec un vrai niveau d'autonomie sur la proposition et la production des contenus, dans le respect des validations. Pour mener à bien ces missions, je disposais des accès aux plateformes sociales, au site Shopify, à Odoo, à l'outil d'emailing et à Trello pour l'organisation.</w:t>
+      </w:r>
+    </w:p>
+    <w:p>
+      <w:pPr>
+        <w:pStyle w:val="Heading2"/>
+      </w:pPr>
+      <w:r>
+        <w:t>b. Interaction avec les services</w:t>
+      </w:r>
+    </w:p>
+    <w:p>
+      <w:pPr>
+        <w:jc w:val="both"/>
+      </w:pPr>
+      <w:r>
+        <w:t>Mon poste m'amenait à interagir avec l'ensemble des services de l'entreprise. Avec la direction, j'échangeais sur l'identité de la marque et la validation des contenus les plus sensibles. Avec le pôle commercial, je coordonnais la mise en avant des partenaires et des revendeurs sur les réseaux. Avec le pôle atelier, je récupérais les informations produits nécessaires aux fiches et aux visuels. Enfin, j'étais en relation directe avec les clients, à qui je répondais par mail et par la messagerie d'Instagram et de Facebook. Notre organisation reposait sur des rituels réguliers : un brief chaque lundi pour cadrer les priorités, un point hebdomadaire de suivi et un reporting transmis chaque lundi.</w:t>
+      </w:r>
+    </w:p>
+    <w:p>
+      <w:pPr>
+        <w:pStyle w:val="Heading2"/>
+      </w:pPr>
+      <w:r>
+        <w:t>c. Stratégie de communication</w:t>
+      </w:r>
+    </w:p>
+    <w:p>
+      <w:pPr>
+        <w:pStyle w:val="Heading3"/>
+      </w:pPr>
+      <w:r>
+        <w:t>i. Constat initial</w:t>
+      </w:r>
+    </w:p>
+    <w:p>
+      <w:pPr>
+        <w:jc w:val="both"/>
+      </w:pPr>
+      <w:r>
+        <w:t>Au démarrage de mon alternance, la marque possédait déjà une belle communauté, mais très inégale d'un réseau à l'autre, et une visibilité qui se convertissait mal en ventes. La sensibilité de l'image ajoutait une contrainte, car il ne suffisait pas de communiquer plus, il fallait communiquer juste. Ce constat a fait naître la problématique du projet : développer la visibilité et les ventes en ligne grâce à une stratégie de communication digitale cohérente, tout en préservant une image singulière et sensible.</w:t>
+      </w:r>
+    </w:p>
+    <w:p>
+      <w:pPr>
+        <w:pStyle w:val="Heading3"/>
+      </w:pPr>
+      <w:r>
+        <w:t>ii. Les cibles</w:t>
+      </w:r>
+    </w:p>
+    <w:p>
+      <w:pPr>
+        <w:jc w:val="both"/>
+      </w:pPr>
+      <w:r>
+        <w:t>La cible principale correspond au persona décrit plus haut, cette femme de trente à soixante ans sensible à l'objet qui a du sens, présente sur les réseaux sociaux et sensible à l'authenticité. À côté de cette cible particulier, la marque adresse aussi une cible professionnelle, celle des revendeurs, que le pôle commercial anime.</w:t>
+      </w:r>
+    </w:p>
+    <w:p>
+      <w:pPr>
+        <w:pStyle w:val="Heading3"/>
+      </w:pPr>
+      <w:r>
+        <w:t>iii. Les objectifs</w:t>
+      </w:r>
+    </w:p>
+    <w:p>
+      <w:pPr>
+        <w:jc w:val="both"/>
+      </w:pPr>
+      <w:r>
+        <w:t>À partir de ces cibles, la marque m'avait fixé des objectifs clairs, qui ont servi de boussole tout au long du projet.</w:t>
+      </w:r>
+    </w:p>
+    <w:p>
+      <w:pPr>
+        <w:pStyle w:val="ListBullet"/>
+      </w:pPr>
+      <w:r>
+        <w:t>Développer la visibilité et la notoriété de la marque.</w:t>
+      </w:r>
+    </w:p>
+    <w:p>
+      <w:pPr>
+        <w:pStyle w:val="ListBullet"/>
+      </w:pPr>
+      <w:r>
+        <w:t>Augmenter le trafic et les ventes sur le site e-commerce.</w:t>
+      </w:r>
+    </w:p>
+    <w:p>
+      <w:pPr>
+        <w:pStyle w:val="ListBullet"/>
+      </w:pPr>
+      <w:r>
+        <w:t>Élargir l'audience sans diluer ni trahir l'identité de la marque.</w:t>
+      </w:r>
+    </w:p>
+    <w:p>
+      <w:pPr>
+        <w:pStyle w:val="ListBullet"/>
+      </w:pPr>
+      <w:r>
+        <w:t>Renforcer la relation et la fidélité des clients existants.</w:t>
+      </w:r>
+    </w:p>
+    <w:p>
+      <w:pPr>
+        <w:pStyle w:val="Heading3"/>
+      </w:pPr>
+      <w:r>
+        <w:t>iv. L'audit des réseaux sociaux</w:t>
+      </w:r>
+    </w:p>
+    <w:p>
+      <w:pPr>
+        <w:jc w:val="both"/>
+      </w:pPr>
+      <w:r>
+        <w:t>Avant d'agir, j'ai dressé un état des lieux chiffré de notre présence digitale.</w:t>
       </w:r>
     </w:p>
     <w:p>
@@ -1229,10 +1275,10 @@
         <w:rPr>
           <w:b/>
         </w:rPr>
-        <w:t xml:space="preserve">Animation des réseaux sociaux : </w:t>
+        <w:t xml:space="preserve">Instagram : </w:t>
       </w:r>
       <w:r>
-        <w:t>publication et programmation des posts, des stories et des vidéos sur Instagram, TikTok et Facebook, et animation de la communauté au quotidien.</w:t>
+        <w:t>environ 30 000 abonnés, de loin notre plateforme la plus forte.</w:t>
       </w:r>
     </w:p>
     <w:p>
@@ -1243,10 +1289,10 @@
         <w:rPr>
           <w:b/>
         </w:rPr>
-        <w:t xml:space="preserve">Création de contenu vidéo : </w:t>
+        <w:t xml:space="preserve">Facebook : </w:t>
       </w:r>
       <w:r>
-        <w:t>conception et réalisation de stories et de Reels vidéo pour les réseaux sociaux, un format que j'ai particulièrement investi pour sa forte portée.</w:t>
+        <w:t>près de 3 000 abonnés, une communauté plus modeste.</w:t>
       </w:r>
     </w:p>
     <w:p>
@@ -1257,24 +1303,10 @@
         <w:rPr>
           <w:b/>
         </w:rPr>
-        <w:t xml:space="preserve">Création de contenu visuel : </w:t>
+        <w:t xml:space="preserve">TikTok : </w:t>
       </w:r>
       <w:r>
-        <w:t>participation aux shootings et préparation des visuels, déclinés pour chaque plateforme.</w:t>
-      </w:r>
-    </w:p>
-    <w:p>
-      <w:pPr>
-        <w:pStyle w:val="ListBullet"/>
-      </w:pPr>
-      <w:r>
-        <w:rPr>
-          <w:b/>
-        </w:rPr>
-        <w:t xml:space="preserve">Gestion du site : </w:t>
-      </w:r>
-      <w:r>
-        <w:t>mise à jour du site et rédaction des fiches produits.</w:t>
+        <w:t>seulement 28 abonnés, un compte tout juste lancé et donc une vraie marge de progression.</w:t>
       </w:r>
     </w:p>
     <w:p>
@@ -1288,37 +1320,31 @@
         <w:t xml:space="preserve">Emailing : </w:t>
       </w:r>
       <w:r>
-        <w:t>participation à la conception et à l'envoi des campagnes email.</w:t>
+        <w:t>une base d'environ 1 200 contacts clients et des newsletters déjà envoyées régulièrement, un socle solide mais encore à optimiser.</w:t>
       </w:r>
     </w:p>
     <w:p>
       <w:pPr>
-        <w:pStyle w:val="ListBullet"/>
+        <w:jc w:val="both"/>
       </w:pPr>
       <w:r>
-        <w:rPr>
-          <w:b/>
-        </w:rPr>
-        <w:t xml:space="preserve">Reporting : </w:t>
-      </w:r>
-      <w:r>
-        <w:t>suivi hebdomadaire des performances et restitution des résultats.</w:t>
+        <w:t>Cet audit confirmait une visibilité très concentrée sur Instagram et un fort potentiel inexploité, notamment sur la vidéo courte avec TikTok et sur la relation client par email.</w:t>
       </w:r>
     </w:p>
     <w:p>
       <w:pPr>
-        <w:jc w:val="both"/>
+        <w:pStyle w:val="Heading2"/>
       </w:pPr>
       <w:r>
-        <w:t>Notre collaboration reposait sur des rituels réguliers : un brief chaque lundi pour cadrer les priorités, un point hebdomadaire de suivi et un reporting transmis chaque lundi. Vers l'extérieur, je livrais mes contenus à la communauté par les publications, mais aussi par la relation directe avec les clients via le mail et la messagerie d'Instagram et de Facebook.</w:t>
+        <w:t>d. Élaboration de la stratégie</w:t>
       </w:r>
     </w:p>
     <w:p>
       <w:pPr>
-        <w:jc w:val="both"/>
+        <w:pStyle w:val="Heading3"/>
       </w:pPr>
       <w:r>
-        <w:t>Deux situations vécues résument bien mon quotidien. La première, plus délicate, a été un partenariat avec l'Olympique de Marseille, qui hésitait à s'associer à la marque de peur que l'univers religieux des statuettes paraisse trop connoté. Cette expérience m'a fait comprendre la sensibilité de l'image de la marque et l'importance de la manière de présenter les choses, en insistant sur la dimension culturelle et populaire de l'objet.</w:t>
+        <w:t>i. Inspirations et analyse</w:t>
       </w:r>
     </w:p>
     <w:p>
@@ -1326,15 +1352,15 @@
         <w:jc w:val="both"/>
       </w:pPr>
       <w:r>
-        <w:t>La seconde a été une vraie réussite, la collaboration avec Karine Le Marchand. Concrètement, elle s'est construite autour d'un produit spécifique, un ex-voto baptisé « le cœur sur la main », créé dans le cadre d'un partenariat entre Karine Le Marchand et J'ai vu la Vierge. Le format de l'opération était simple mais redoutablement efficace, puisque Karine Le Marchand a présenté le produit à sa communauté à travers une story Instagram. Les retombées ont été immédiates et très concrètes, car cette seule prise de parole a généré plus de cinquante achats du produit. Cet exemple m'a montré à quel point une communication ciblée, portée par la bonne personne et au bon format, peut transformer une simple story en résultats commerciaux réels.</w:t>
+        <w:t>Je me suis inspirée des marques de décoration et de lifestyle qui réussissent sur les réseaux, en analysant leurs formats, leur ton et leur rythme de publication, puis en les confrontant à l'identité singulière de J'ai vu la Vierge pour ne garder que ce qui lui ressemblait.</w:t>
       </w:r>
     </w:p>
     <w:p>
       <w:pPr>
-        <w:pStyle w:val="Heading2"/>
+        <w:pStyle w:val="Heading3"/>
       </w:pPr>
       <w:r>
-        <w:t>2.2 Focus projet : la stratégie de communication digitale</w:t>
+        <w:t>ii. Élaboration</w:t>
       </w:r>
     </w:p>
     <w:p>
@@ -1342,95 +1368,7 @@
         <w:jc w:val="both"/>
       </w:pPr>
       <w:r>
-        <w:t>Le projet central de mon alternance a été la stratégie de communication digitale de la marque. Il répond directement à sa stratégie d'entreprise, qui vise à transformer une forte notoriété sociale en ventes en ligne durables. J'y ai assumé un vrai niveau de responsabilité, de la proposition des contenus jusqu'à l'analyse de leurs performances.</w:t>
-      </w:r>
-    </w:p>
-    <w:p>
-      <w:pPr>
-        <w:pStyle w:val="Heading3"/>
-      </w:pPr>
-      <w:r>
-        <w:t>2.2.1 Constat initial et problématique</w:t>
-      </w:r>
-    </w:p>
-    <w:p>
-      <w:pPr>
-        <w:jc w:val="both"/>
-      </w:pPr>
-      <w:r>
-        <w:t>Au démarrage de mon alternance, la marque possédait déjà une belle communauté, mais très inégale d'un réseau à l'autre. Sur Instagram, de loin notre plateforme la plus forte, nous comptions environ 30 000 abonnés. Sur Facebook, la communauté était plus modeste, avec près de 3 000 abonnés. Sur TikTok, enfin, le compte n'en était qu'à ses tout débuts, avec seulement 28 abonnés, ce qui représentait autant une faiblesse qu'une vraie marge de progression. Côté emailing, la marque disposait déjà d'une base d'environ 1 200 contacts clients et envoyait régulièrement des newsletters, ce qui constituait un socle solide sur lequel m'appuyer, même si ce canal pouvait encore être mieux structuré et optimisé.</w:t>
-      </w:r>
-    </w:p>
-    <w:p>
-      <w:pPr>
-        <w:jc w:val="both"/>
-      </w:pPr>
-      <w:r>
-        <w:t>Ce panorama révélait un déséquilibre. La marque était très visible par moments, mais cette visibilité reposait sur un canal fragile, les réseaux sociaux, et se convertissait mal en trafic et en ventes. La sensibilité de l'image ajoutait une contrainte, car il ne suffisait pas de communiquer plus, il fallait communiquer juste. De là découle la problématique du projet : comment développer la visibilité et les performances e-commerce de la marque grâce à une stratégie de communication digitale cohérente, tout en préservant une image singulière et sensible ?</w:t>
-      </w:r>
-    </w:p>
-    <w:p>
-      <w:pPr>
-        <w:pStyle w:val="Heading3"/>
-      </w:pPr>
-      <w:r>
-        <w:t>2.2.2 Cibles et objectifs</w:t>
-      </w:r>
-    </w:p>
-    <w:p>
-      <w:pPr>
-        <w:jc w:val="both"/>
-      </w:pPr>
-      <w:r>
-        <w:t>La cible principale correspond au persona décrit plus haut, cette femme de trente à soixante ans sensible à l'objet qui a du sens. À partir de là, la marque m'avait fixé des objectifs clairs, qui ont servi de boussole tout au long du projet.</w:t>
-      </w:r>
-    </w:p>
-    <w:p>
-      <w:pPr>
-        <w:pStyle w:val="ListBullet"/>
-      </w:pPr>
-      <w:r>
-        <w:t>Développer la visibilité et la notoriété de la marque.</w:t>
-      </w:r>
-    </w:p>
-    <w:p>
-      <w:pPr>
-        <w:pStyle w:val="ListBullet"/>
-      </w:pPr>
-      <w:r>
-        <w:t>Augmenter le trafic et les ventes sur le site e-commerce.</w:t>
-      </w:r>
-    </w:p>
-    <w:p>
-      <w:pPr>
-        <w:pStyle w:val="ListBullet"/>
-      </w:pPr>
-      <w:r>
-        <w:t>Élargir l'audience sans diluer ni trahir l'identité de la marque.</w:t>
-      </w:r>
-    </w:p>
-    <w:p>
-      <w:pPr>
-        <w:pStyle w:val="ListBullet"/>
-      </w:pPr>
-      <w:r>
-        <w:t>Renforcer la relation et la fidélité des clients existants.</w:t>
-      </w:r>
-    </w:p>
-    <w:p>
-      <w:pPr>
-        <w:pStyle w:val="Heading3"/>
-      </w:pPr>
-      <w:r>
-        <w:t>2.2.3 Les scénarios et stratégies envisagés</w:t>
-      </w:r>
-    </w:p>
-    <w:p>
-      <w:pPr>
-        <w:jc w:val="both"/>
-      </w:pPr>
-      <w:r>
-        <w:t>Pour atteindre ces objectifs, j'ai raisonné autour de trois scénarios possibles, que j'ai comparés avant de trancher.</w:t>
+        <w:t>J'ai raisonné autour de trois scénarios possibles, que j'ai comparés avant de trancher.</w:t>
       </w:r>
     </w:p>
     <w:tbl>
@@ -1562,64 +1500,6 @@
                 <w:sz w:val="20"/>
               </w:rPr>
               <w:t>Maîtrisé</w:t>
-            </w:r>
-          </w:p>
-        </w:tc>
-      </w:tr>
-      <w:tr>
-        <w:tc>
-          <w:tcPr>
-            <w:tcW w:type="dxa" w:w="2351"/>
-          </w:tcPr>
-          <w:p>
-            <w:r/>
-            <w:r>
-              <w:rPr>
-                <w:sz w:val="20"/>
-              </w:rPr>
-              <w:t>Délai</w:t>
-            </w:r>
-          </w:p>
-        </w:tc>
-        <w:tc>
-          <w:tcPr>
-            <w:tcW w:type="dxa" w:w="2351"/>
-          </w:tcPr>
-          <w:p>
-            <w:r/>
-            <w:r>
-              <w:rPr>
-                <w:sz w:val="20"/>
-              </w:rPr>
-              <w:t>Court</w:t>
-            </w:r>
-          </w:p>
-        </w:tc>
-        <w:tc>
-          <w:tcPr>
-            <w:tcW w:type="dxa" w:w="2351"/>
-          </w:tcPr>
-          <w:p>
-            <w:r/>
-            <w:r>
-              <w:rPr>
-                <w:sz w:val="20"/>
-              </w:rPr>
-              <w:t>Moyen</w:t>
-            </w:r>
-          </w:p>
-        </w:tc>
-        <w:tc>
-          <w:tcPr>
-            <w:tcW w:type="dxa" w:w="2351"/>
-          </w:tcPr>
-          <w:p>
-            <w:r/>
-            <w:r>
-              <w:rPr>
-                <w:sz w:val="20"/>
-              </w:rPr>
-              <w:t>Progressif</w:t>
             </w:r>
           </w:p>
         </w:tc>
@@ -1817,220 +1697,7 @@
         <w:jc w:val="both"/>
       </w:pPr>
       <w:r>
-        <w:t>J'ai retenu le scénario C, la stratégie mixte, car c'est le seul qui répond à l'ensemble des objectifs à la fois : la visibilité par les réseaux, la conversion par l'emailing et la maîtrise de l'image par des temps forts soigneusement préparés. À l'intérieur de ce scénario, le levier emailing posait une question d'outil que j'ai instruite à part.</w:t>
-      </w:r>
-    </w:p>
-    <w:tbl>
-      <w:tblPr>
-        <w:tblStyle w:val="TableGrid"/>
-        <w:tblW w:type="auto" w:w="0"/>
-        <w:jc w:val="center"/>
-        <w:tblLook w:firstColumn="1" w:firstRow="1" w:lastColumn="0" w:lastRow="0" w:noHBand="0" w:noVBand="1" w:val="04A0"/>
-      </w:tblPr>
-      <w:tblGrid>
-        <w:gridCol w:w="3135"/>
-        <w:gridCol w:w="3135"/>
-        <w:gridCol w:w="3135"/>
-      </w:tblGrid>
-      <w:tr>
-        <w:tc>
-          <w:tcPr>
-            <w:tcW w:type="dxa" w:w="3135"/>
-          </w:tcPr>
-          <w:p>
-            <w:r/>
-            <w:r>
-              <w:rPr>
-                <w:b/>
-                <w:sz w:val="20"/>
-              </w:rPr>
-              <w:t>Solution</w:t>
-            </w:r>
-          </w:p>
-        </w:tc>
-        <w:tc>
-          <w:tcPr>
-            <w:tcW w:type="dxa" w:w="3135"/>
-          </w:tcPr>
-          <w:p>
-            <w:r/>
-            <w:r>
-              <w:rPr>
-                <w:b/>
-                <w:sz w:val="20"/>
-              </w:rPr>
-              <w:t>Atouts</w:t>
-            </w:r>
-          </w:p>
-        </w:tc>
-        <w:tc>
-          <w:tcPr>
-            <w:tcW w:type="dxa" w:w="3135"/>
-          </w:tcPr>
-          <w:p>
-            <w:r/>
-            <w:r>
-              <w:rPr>
-                <w:b/>
-                <w:sz w:val="20"/>
-              </w:rPr>
-              <w:t>Limites</w:t>
-            </w:r>
-          </w:p>
-        </w:tc>
-      </w:tr>
-      <w:tr>
-        <w:tc>
-          <w:tcPr>
-            <w:tcW w:type="dxa" w:w="3135"/>
-          </w:tcPr>
-          <w:p>
-            <w:r/>
-            <w:r>
-              <w:rPr>
-                <w:sz w:val="20"/>
-              </w:rPr>
-              <w:t>Kiliba</w:t>
-            </w:r>
-          </w:p>
-        </w:tc>
-        <w:tc>
-          <w:tcPr>
-            <w:tcW w:type="dxa" w:w="3135"/>
-          </w:tcPr>
-          <w:p>
-            <w:r/>
-            <w:r>
-              <w:rPr>
-                <w:sz w:val="20"/>
-              </w:rPr>
-              <w:t>Ciblage par intelligence artificielle selon le comportement des utilisateurs ; intégration directe à Shopify ; mise en place rapide.</w:t>
-            </w:r>
-          </w:p>
-        </w:tc>
-        <w:tc>
-          <w:tcPr>
-            <w:tcW w:type="dxa" w:w="3135"/>
-          </w:tcPr>
-          <w:p>
-            <w:r/>
-            <w:r>
-              <w:rPr>
-                <w:sz w:val="20"/>
-              </w:rPr>
-              <w:t>Personnalisation graphique limitée ; coût d'abonnement.</w:t>
-            </w:r>
-          </w:p>
-        </w:tc>
-      </w:tr>
-      <w:tr>
-        <w:tc>
-          <w:tcPr>
-            <w:tcW w:type="dxa" w:w="3135"/>
-          </w:tcPr>
-          <w:p>
-            <w:r/>
-            <w:r>
-              <w:rPr>
-                <w:sz w:val="20"/>
-              </w:rPr>
-              <w:t>Shopify natif</w:t>
-            </w:r>
-          </w:p>
-        </w:tc>
-        <w:tc>
-          <w:tcPr>
-            <w:tcW w:type="dxa" w:w="3135"/>
-          </w:tcPr>
-          <w:p>
-            <w:r/>
-            <w:r>
-              <w:rPr>
-                <w:sz w:val="20"/>
-              </w:rPr>
-              <w:t>Intégré et simple ; peu coûteux.</w:t>
-            </w:r>
-          </w:p>
-        </w:tc>
-        <w:tc>
-          <w:tcPr>
-            <w:tcW w:type="dxa" w:w="3135"/>
-          </w:tcPr>
-          <w:p>
-            <w:r/>
-            <w:r>
-              <w:rPr>
-                <w:sz w:val="20"/>
-              </w:rPr>
-              <w:t>Design et fonctionnalités limités ; peu différenciant.</w:t>
-            </w:r>
-          </w:p>
-        </w:tc>
-      </w:tr>
-      <w:tr>
-        <w:tc>
-          <w:tcPr>
-            <w:tcW w:type="dxa" w:w="3135"/>
-          </w:tcPr>
-          <w:p>
-            <w:r/>
-            <w:r>
-              <w:rPr>
-                <w:sz w:val="20"/>
-              </w:rPr>
-              <w:t>Outil sur mesure</w:t>
-            </w:r>
-          </w:p>
-        </w:tc>
-        <w:tc>
-          <w:tcPr>
-            <w:tcW w:type="dxa" w:w="3135"/>
-          </w:tcPr>
-          <w:p>
-            <w:r/>
-            <w:r>
-              <w:rPr>
-                <w:sz w:val="20"/>
-              </w:rPr>
-              <w:t>Contrôle total de l'identité visuelle ; adaptable aux temps forts ; gratuit à l'usage.</w:t>
-            </w:r>
-          </w:p>
-        </w:tc>
-        <w:tc>
-          <w:tcPr>
-            <w:tcW w:type="dxa" w:w="3135"/>
-          </w:tcPr>
-          <w:p>
-            <w:r/>
-            <w:r>
-              <w:rPr>
-                <w:sz w:val="20"/>
-              </w:rPr>
-              <w:t>Nécessite du développement et de la maintenance.</w:t>
-            </w:r>
-          </w:p>
-        </w:tc>
-      </w:tr>
-    </w:tbl>
-    <w:p>
-      <w:pPr>
-        <w:jc w:val="center"/>
-      </w:pPr>
-      <w:r>
-        <w:rPr>
-          <w:i/>
-          <w:sz w:val="18"/>
-        </w:rPr>
-        <w:t>Tableau 5 : Comparaison des solutions d'emailing envisagées</w:t>
-      </w:r>
-    </w:p>
-    <w:p/>
-    <w:p>
-      <w:pPr>
-        <w:jc w:val="both"/>
-      </w:pPr>
-      <w:r>
-        <w:t>Le raisonnement a conduit à privilégier Kiliba pour la partie automatisée et ciblée, tout en développant un studio d'emailing sur mesure pour les communications premium où l'identité visuelle prime. Ce choix par les risques et par la cohérence avec les objectifs m'a permis de défendre la décision de manière argumentée.</w:t>
+        <w:t>J'ai retenu le scénario C, la stratégie mixte, car c'est le seul qui répond à l'ensemble des objectifs à la fois. À l'intérieur de ce scénario, le levier emailing posait une question d'outil, que j'ai tranchée en privilégiant Kiliba pour le ciblage par intelligence artificielle et son intégration à Shopify, tout en développant un studio d'emailing sur mesure pour les communications premium.</w:t>
       </w:r>
     </w:p>
     <w:p>
@@ -2038,7 +1705,7 @@
         <w:pStyle w:val="Heading3"/>
       </w:pPr>
       <w:r>
-        <w:t>2.2.4 Mise en œuvre : organisation, méthodes et planning</w:t>
+        <w:t>iii. Organisation</w:t>
       </w:r>
     </w:p>
     <w:p>
@@ -2046,15 +1713,39 @@
         <w:jc w:val="both"/>
       </w:pPr>
       <w:r>
-        <w:t>Pour piloter cette stratégie, je me suis appuyée sur une organisation structurée. Mon outil central était Trello, sur lequel je planifiais toutes les tâches sous forme de tableau, dans une logique kanban, en suivant chaque contenu de l'idée jusqu'à la publication. Chaque création suivait un circuit de validation en deux temps, par la créatrice et par ma tutrice, ce qui garantissait la cohérence avec l'identité de la marque.</w:t>
+        <w:t>Pour piloter la stratégie, mon outil central était Trello, sur lequel je planifiais toutes les tâches dans une logique kanban, en suivant chaque contenu de l'idée jusqu'à la publication. Chaque création suivait un circuit de validation en deux temps, par la créatrice et par ma tutrice, ce qui garantissait la cohérence avec l'identité de la marque.</w:t>
       </w:r>
     </w:p>
     <w:p>
       <w:pPr>
+        <w:pStyle w:val="Heading3"/>
+      </w:pPr>
+      <w:r>
+        <w:t>iv. Création de contenu</w:t>
+      </w:r>
+    </w:p>
+    <w:p>
+      <w:pPr>
         <w:jc w:val="both"/>
       </w:pPr>
       <w:r>
-        <w:t>Sur les réseaux, j'ai travaillé une ligne éditoriale fidèle au ton de la marque, en équilibrant plusieurs familles de contenus : les contenus produits, les coulisses, les temps forts et les formats spontanés inspirés des tendances. J'ai particulièrement investi la vidéo courte, avec les Reels et TikTok, car c'est le format qui offre la meilleure portée organique. Les actions se sont déployées progressivement sur l'année, selon le rétroplanning ci-dessous.</w:t>
+        <w:t>J'ai construit une ligne éditoriale fidèle au ton de la marque, en équilibrant plusieurs familles de contenus : les contenus produits qui donnent envie d'acheter, les coulisses qui créent de la proximité, les temps forts qui font l'événement, et les formats spontanés inspirés des tendances qui captent de nouveaux publics.</w:t>
+      </w:r>
+    </w:p>
+    <w:p>
+      <w:pPr>
+        <w:pStyle w:val="Heading3"/>
+      </w:pPr>
+      <w:r>
+        <w:t>v. Diffusion</w:t>
+      </w:r>
+    </w:p>
+    <w:p>
+      <w:pPr>
+        <w:jc w:val="both"/>
+      </w:pPr>
+      <w:r>
+        <w:t>La diffusion suivait un planning réfléchi, avec une cadence régulière de publications adaptée à chaque plateforme et concentrée sur les temps forts à plus fort impact. Les actions se sont déployées progressivement sur l'année, selon le rétroplanning ci-dessous.</w:t>
       </w:r>
     </w:p>
     <w:tbl>
@@ -2203,7 +1894,7 @@
               <w:rPr>
                 <w:sz w:val="20"/>
               </w:rPr>
-              <w:t>Animation régulière des réseaux, contenus et fiches produits, rituels de reporting.</w:t>
+              <w:t>Animation régulière des réseaux, contenus et fiches produits.</w:t>
             </w:r>
           </w:p>
         </w:tc>
@@ -2249,7 +1940,7 @@
               <w:rPr>
                 <w:sz w:val="20"/>
               </w:rPr>
-              <w:t>Préparation et relais des opérations, dont la collaboration Karine Le Marchand.</w:t>
+              <w:t>Opérations et collaborations, dont Karine Le Marchand.</w:t>
             </w:r>
           </w:p>
         </w:tc>
@@ -2356,7 +2047,7 @@
           <w:i/>
           <w:sz w:val="18"/>
         </w:rPr>
-        <w:t>Tableau 6 : Rétroplanning simplifié des actions sur l'année</w:t>
+        <w:t>Tableau 5 : Rétroplanning simplifié des actions sur l'année</w:t>
       </w:r>
     </w:p>
     <w:p/>
@@ -2389,7 +2080,7 @@
         <w:pStyle w:val="Heading3"/>
       </w:pPr>
       <w:r>
-        <w:t>2.2.5 Les livrables</w:t>
+        <w:t>vi. Outils utilisés</w:t>
       </w:r>
     </w:p>
     <w:p>
@@ -2397,23 +2088,62 @@
         <w:jc w:val="both"/>
       </w:pPr>
       <w:r>
-        <w:t>Le principal livrable technique du projet est le studio d'emailing sur mesure. Cet outil repose sur une direction artistique sobre et élégante, de type musée, avec des modèles prêts à l'emploi comme une invitation de type vernissage, un email de bienvenue et un programme du mois. L'utilisateur choisit un modèle, renseigne les contenus, prévisualise le rendu comme une œuvre encadrée, puis envoie la campagne. Il garantit que chaque email respecte parfaitement l'univers de la marque. À cela s'ajoutent l'ensemble des contenus produits pour les réseaux et les fiches produits enrichies sur le site. Des captures figurent en annexe.</w:t>
+        <w:t>Le projet s'appuyait sur un environnement technique complet : Shopify pour le site, les fiches produits et les données de vente, Odoo pour les revendeurs, Kiliba pour l'emailing automatisé, un studio d'emailing sur mesure pour les communications premium, Trello pour la gestion de projet, et les outils natifs d'Instagram, TikTok et Facebook pour la programmation et le suivi.</w:t>
       </w:r>
     </w:p>
     <w:p>
-      <w:pPr>
-        <w:pStyle w:val="Heading3"/>
-      </w:pPr>
       <w:r>
-        <w:t>2.2.6 Les indicateurs de performance et les résultats</w:t>
+        <w:rPr>
+          <w:i/>
+          <w:highlight w:val="yellow"/>
+        </w:rPr>
+        <w:t>[À compléter : ajoutez vos outils de création de visuels et de montage vidéo, par exemple Canva, CapCut ou la suite Adobe]</w:t>
       </w:r>
     </w:p>
     <w:p>
       <w:pPr>
+        <w:pStyle w:val="Heading3"/>
+      </w:pPr>
+      <w:r>
+        <w:t>vii. Les différents formats</w:t>
+      </w:r>
+    </w:p>
+    <w:p>
+      <w:pPr>
         <w:jc w:val="both"/>
       </w:pPr>
       <w:r>
-        <w:t>Pour piloter la stratégie, j'ai suivi des indicateurs répartis sur tout le parcours client, de la notoriété jusqu'à la fidélisation, afin de comprendre où se situaient les points forts et les points de fuite.</w:t>
+        <w:t>J'ai travaillé une palette de formats variés pour couvrir tout le parcours d'attention : les posts pour installer l'univers, les carrousels pour raconter et informer, les stories pour l'instantané et l'interaction, et les vidéos courtes pour la portée.</w:t>
+      </w:r>
+    </w:p>
+    <w:p>
+      <w:pPr>
+        <w:jc w:val="both"/>
+      </w:pPr>
+      <w:r>
+        <w:rPr>
+          <w:b/>
+        </w:rPr>
+        <w:t xml:space="preserve">Zoom sur les vidéos. </w:t>
+      </w:r>
+      <w:r>
+        <w:t>Les stories et les Reels vidéo ont été un axe fort de mon travail. Ce sont les formats qui offrent aujourd'hui la meilleure portée organique et qui permettent de toucher de nouveaux publics. J'ai conçu, tourné et monté ces vidéos en m'appuyant sur les tendances, ce qui a soutenu la croissance de la marque, en particulier sur TikTok, où tout restait à construire.</w:t>
+      </w:r>
+    </w:p>
+    <w:p>
+      <w:pPr>
+        <w:pStyle w:val="Heading3"/>
+      </w:pPr>
+      <w:r>
+        <w:t>viii. Indicateurs de performance</w:t>
+      </w:r>
+    </w:p>
+    <w:p>
+      <w:pPr>
+        <w:jc w:val="both"/>
+      </w:pPr>
+      <w:r>
+        <w:t>Pour piloter la stratégie, j'ai suivi des indicateurs répartis sur tout le parcours client, de la notoriété jusqu'à la fidélisation.</w:t>
       </w:r>
     </w:p>
     <w:tbl>
@@ -2676,7 +2406,7 @@
               <w:rPr>
                 <w:sz w:val="20"/>
               </w:rPr>
-              <w:t>Taux d'ouverture, taux de clic, désabonnement</w:t>
+              <w:t>Taux d'ouverture, taux de clic</w:t>
             </w:r>
           </w:p>
         </w:tc>
@@ -2705,18 +2435,10 @@
           <w:i/>
           <w:sz w:val="18"/>
         </w:rPr>
-        <w:t>Tableau 7 : Les indicateurs de performance suivis</w:t>
+        <w:t>Tableau 6 : Les indicateurs de performance suivis</w:t>
       </w:r>
     </w:p>
     <w:p/>
-    <w:p>
-      <w:pPr>
-        <w:jc w:val="both"/>
-      </w:pPr>
-      <w:r>
-        <w:t>Le tableau ci-dessous met en regard la situation de départ et les résultats obtenus. Les valeurs de départ sont connues, celles d'arrivée sont à compléter avec vos chiffres réels.</w:t>
-      </w:r>
-    </w:p>
     <w:tbl>
       <w:tblPr>
         <w:tblStyle w:val="TableGrid"/>
@@ -3040,134 +2762,6 @@
           </w:p>
         </w:tc>
       </w:tr>
-      <w:tr>
-        <w:tc>
-          <w:tcPr>
-            <w:tcW w:type="dxa" w:w="2351"/>
-          </w:tcPr>
-          <w:p>
-            <w:r/>
-            <w:r>
-              <w:rPr>
-                <w:sz w:val="20"/>
-              </w:rPr>
-              <w:t>Taux d'ouverture email</w:t>
-            </w:r>
-          </w:p>
-        </w:tc>
-        <w:tc>
-          <w:tcPr>
-            <w:tcW w:type="dxa" w:w="2351"/>
-          </w:tcPr>
-          <w:p>
-            <w:r/>
-            <w:r>
-              <w:rPr>
-                <w:i/>
-                <w:sz w:val="20"/>
-                <w:highlight w:val="yellow"/>
-              </w:rPr>
-              <w:t>[à compléter]</w:t>
-            </w:r>
-          </w:p>
-        </w:tc>
-        <w:tc>
-          <w:tcPr>
-            <w:tcW w:type="dxa" w:w="2351"/>
-          </w:tcPr>
-          <w:p>
-            <w:r/>
-            <w:r>
-              <w:rPr>
-                <w:i/>
-                <w:sz w:val="20"/>
-                <w:highlight w:val="yellow"/>
-              </w:rPr>
-              <w:t>[à compléter]</w:t>
-            </w:r>
-          </w:p>
-        </w:tc>
-        <w:tc>
-          <w:tcPr>
-            <w:tcW w:type="dxa" w:w="2351"/>
-          </w:tcPr>
-          <w:p>
-            <w:r/>
-            <w:r>
-              <w:rPr>
-                <w:i/>
-                <w:sz w:val="20"/>
-                <w:highlight w:val="yellow"/>
-              </w:rPr>
-              <w:t>[à compléter]</w:t>
-            </w:r>
-          </w:p>
-        </w:tc>
-      </w:tr>
-      <w:tr>
-        <w:tc>
-          <w:tcPr>
-            <w:tcW w:type="dxa" w:w="2351"/>
-          </w:tcPr>
-          <w:p>
-            <w:r/>
-            <w:r>
-              <w:rPr>
-                <w:sz w:val="20"/>
-              </w:rPr>
-              <w:t>Taux de conversion</w:t>
-            </w:r>
-          </w:p>
-        </w:tc>
-        <w:tc>
-          <w:tcPr>
-            <w:tcW w:type="dxa" w:w="2351"/>
-          </w:tcPr>
-          <w:p>
-            <w:r/>
-            <w:r>
-              <w:rPr>
-                <w:i/>
-                <w:sz w:val="20"/>
-                <w:highlight w:val="yellow"/>
-              </w:rPr>
-              <w:t>[à compléter]</w:t>
-            </w:r>
-          </w:p>
-        </w:tc>
-        <w:tc>
-          <w:tcPr>
-            <w:tcW w:type="dxa" w:w="2351"/>
-          </w:tcPr>
-          <w:p>
-            <w:r/>
-            <w:r>
-              <w:rPr>
-                <w:i/>
-                <w:sz w:val="20"/>
-                <w:highlight w:val="yellow"/>
-              </w:rPr>
-              <w:t>[à compléter]</w:t>
-            </w:r>
-          </w:p>
-        </w:tc>
-        <w:tc>
-          <w:tcPr>
-            <w:tcW w:type="dxa" w:w="2351"/>
-          </w:tcPr>
-          <w:p>
-            <w:r/>
-            <w:r>
-              <w:rPr>
-                <w:i/>
-                <w:sz w:val="20"/>
-                <w:highlight w:val="yellow"/>
-              </w:rPr>
-              <w:t>[à compléter]</w:t>
-            </w:r>
-          </w:p>
-        </w:tc>
-      </w:tr>
     </w:tbl>
     <w:p>
       <w:pPr>
@@ -3178,7 +2772,7 @@
           <w:i/>
           <w:sz w:val="18"/>
         </w:rPr>
-        <w:t>Tableau 8 : Résultats avant et après la mise en œuvre</w:t>
+        <w:t>Tableau 7 : Résultats avant et après la mise en œuvre</w:t>
       </w:r>
     </w:p>
     <w:p/>
@@ -3188,15 +2782,127 @@
           <w:i/>
           <w:highlight w:val="yellow"/>
         </w:rPr>
-        <w:t>[À compléter : commentez vos chiffres réels : quelles actions ont le mieux fonctionné et quels temps forts ont généré le plus de visibilité et de ventes]</w:t>
+        <w:t>[À compléter : commentez vos chiffres réels une fois complétés : quelles actions ont le mieux fonctionné]</w:t>
       </w:r>
     </w:p>
     <w:p>
       <w:pPr>
+        <w:pStyle w:val="Heading2"/>
+      </w:pPr>
+      <w:r>
+        <w:t>e. Les différentes missions</w:t>
+      </w:r>
+    </w:p>
+    <w:p>
+      <w:pPr>
+        <w:jc w:val="both"/>
+      </w:pPr>
+      <w:r>
+        <w:t>Au delà du pilotage de la stratégie, mon alternance s'est traduite par des missions concrètes et quotidiennes, que je détaille ici.</w:t>
+      </w:r>
+    </w:p>
+    <w:p>
+      <w:pPr>
         <w:pStyle w:val="Heading3"/>
       </w:pPr>
       <w:r>
-        <w:t>2.2.7 Difficultés, valeur ajoutée et axes d'amélioration</w:t>
+        <w:t>i. Animation des réseaux sociaux</w:t>
+      </w:r>
+    </w:p>
+    <w:p>
+      <w:pPr>
+        <w:jc w:val="both"/>
+      </w:pPr>
+      <w:r>
+        <w:t>J'animais au quotidien les comptes Instagram, TikTok et Facebook de la marque. Cela comprenait la programmation et la publication des contenus, mais aussi tout le travail de communauté : répondre aux commentaires et aux messages, entretenir la relation avec les abonnés et faire remonter leurs retours. Cette présence régulière est ce qui maintient le lien vivant entre la marque et son public.</w:t>
+      </w:r>
+    </w:p>
+    <w:p>
+      <w:pPr>
+        <w:pStyle w:val="Heading3"/>
+      </w:pPr>
+      <w:r>
+        <w:t>ii. Stories et Reels vidéo</w:t>
+      </w:r>
+    </w:p>
+    <w:p>
+      <w:pPr>
+        <w:jc w:val="both"/>
+      </w:pPr>
+      <w:r>
+        <w:t>La création de stories et de Reels vidéo a occupé une place importante dans mes missions. Je concevais les idées, je tournais et je montais ces vidéos, en m'inspirant des tendances tout en respectant l'univers de la marque. J'ai particulièrement investi ce format court car c'est celui qui génère le plus de portée et qui a permis de faire connaître la marque à de nouveaux publics, notamment sur TikTok.</w:t>
+      </w:r>
+    </w:p>
+    <w:p>
+      <w:pPr>
+        <w:pStyle w:val="Heading3"/>
+      </w:pPr>
+      <w:r>
+        <w:t>iii. Shootings et création visuelle</w:t>
+      </w:r>
+    </w:p>
+    <w:p>
+      <w:pPr>
+        <w:jc w:val="both"/>
+      </w:pPr>
+      <w:r>
+        <w:t>Je participais aux shootings des produits et je préparais les visuels, en soignant la mise en scène et la cohérence avec l'identité de la marque. Chaque visuel était ensuite décliné selon les codes de chaque plateforme, afin d'être toujours au bon format et au bon endroit.</w:t>
+      </w:r>
+    </w:p>
+    <w:p>
+      <w:pPr>
+        <w:pStyle w:val="Heading3"/>
+      </w:pPr>
+      <w:r>
+        <w:t>iv. Fiches produits et site e-commerce</w:t>
+      </w:r>
+    </w:p>
+    <w:p>
+      <w:pPr>
+        <w:jc w:val="both"/>
+      </w:pPr>
+      <w:r>
+        <w:t>J'assurais la mise à jour du site e-commerce et la rédaction des fiches produits. L'enjeu était double : présenter chaque référence de façon claire et désirable pour donner envie d'acheter, et soigner la rédaction pour servir à la fois l'image de la marque et le référencement du site.</w:t>
+      </w:r>
+    </w:p>
+    <w:p>
+      <w:pPr>
+        <w:pStyle w:val="Heading3"/>
+      </w:pPr>
+      <w:r>
+        <w:t>v. Emailing et newsletters</w:t>
+      </w:r>
+    </w:p>
+    <w:p>
+      <w:pPr>
+        <w:jc w:val="both"/>
+      </w:pPr>
+      <w:r>
+        <w:t>Je participais à la conception et à l'envoi des campagnes email et des newsletters adressées à notre base de contacts. Ce canal, que la marque maîtrise totalement, servait à entretenir la relation client, à annoncer les nouveautés et les temps forts et à soutenir les ventes du site.</w:t>
+      </w:r>
+    </w:p>
+    <w:p>
+      <w:pPr>
+        <w:pStyle w:val="Heading3"/>
+      </w:pPr>
+      <w:r>
+        <w:t>vi. Reporting et suivi des performances</w:t>
+      </w:r>
+    </w:p>
+    <w:p>
+      <w:pPr>
+        <w:jc w:val="both"/>
+      </w:pPr>
+      <w:r>
+        <w:t>Chaque semaine, je réalisais un reporting des performances, en suivant les indicateurs des réseaux, du site et de l'emailing. Cette mission m'a appris à mesurer l'impact réel de chaque action, à en tirer des enseignements et à ajuster la stratégie en conséquence.</w:t>
+      </w:r>
+    </w:p>
+    <w:p>
+      <w:pPr>
+        <w:pStyle w:val="Heading2"/>
+      </w:pPr>
+      <w:r>
+        <w:t>f. Retour d'expérience</w:t>
       </w:r>
     </w:p>
     <w:p>
@@ -3213,7 +2919,7 @@
           <w:i/>
           <w:highlight w:val="yellow"/>
         </w:rPr>
-        <w:t>[À compléter : ajoutez si vous le souhaitez une ou deux autres difficultés concrètes rencontrées sur le projet]</w:t>
+        <w:t>[À compléter : ajoutez si vous le souhaitez une ou deux autres difficultés concrètes rencontrées]</w:t>
       </w:r>
     </w:p>
     <w:p>
@@ -3221,7 +2927,7 @@
         <w:jc w:val="both"/>
       </w:pPr>
       <w:r>
-        <w:t>Ma valeur ajoutée a été d'apporter à la marque une animation digitale régulière et cohérente, de contribuer à la réussite de temps forts comme la collaboration Karine Le Marchand, et de faire monter en puissance des canaux encore peu exploités comme TikTok et l'emailing. Les principaux axes d'amélioration que j'identifie sont de structurer plus tôt le levier de l'emailing et la collecte des données clients, et de mettre en place dès le départ un tableau de suivi des indicateurs plus complet pour mesurer l'impact de chaque action avec des preuves chiffrées.</w:t>
+        <w:t>Ma valeur ajoutée a été d'apporter à la marque une animation digitale régulière et cohérente, de contribuer à des temps forts comme la collaboration Karine Le Marchand, qui a généré plus de cinquante ventes à partir d'une seule story, et de faire monter en puissance des canaux encore peu exploités comme TikTok et l'emailing. Les principaux axes d'amélioration que j'identifie sont de structurer plus tôt le levier de l'emailing et la collecte des données clients, et de mettre en place dès le départ un tableau de suivi des indicateurs plus complet.</w:t>
       </w:r>
     </w:p>
     <w:p>
@@ -3242,7 +2948,7 @@
         <w:pStyle w:val="Heading2"/>
       </w:pPr>
       <w:r>
-        <w:t>3.1 Synthèse</w:t>
+        <w:t>a. Synthèse</w:t>
       </w:r>
     </w:p>
     <w:p>
@@ -3250,7 +2956,7 @@
         <w:jc w:val="both"/>
       </w:pPr>
       <w:r>
-        <w:t>Durant mon alternance chez J'ai vu la Vierge, j'ai piloté la stratégie de communication digitale d'une marque à l'identité forte et sensible. Partant d'une visibilité concentrée sur Instagram et d'une conversion insuffisante, j'ai animé au quotidien Instagram, TikTok et Facebook, produit les contenus et les fiches produits, participé à l'emailing et assuré le reporting des performances. J'ai comparé plusieurs scénarios avant de retenir une stratégie mixte, combinant l'animation des réseaux, l'emailing et les temps forts, et j'ai contribué à des opérations marquantes comme la collaboration avec Karine Le Marchand, qui a généré plus de cinquante ventes à partir d'une seule story. Cette lecture d'ensemble suffit à comprendre l'essentiel de ce que j'ai réalisé et des résultats obtenus.</w:t>
+        <w:t>Durant mon alternance chez J'ai vu la Vierge, j'ai piloté la stratégie de communication digitale d'une marque à l'identité forte et sensible. Partant d'une visibilité concentrée sur Instagram et d'une conversion insuffisante, j'ai animé au quotidien Instagram, TikTok et Facebook, produit les contenus, les stories, les Reels et les fiches produits, participé à l'emailing et assuré le reporting. J'ai comparé plusieurs scénarios avant de retenir une stratégie mixte, et j'ai contribué à des opérations marquantes comme la collaboration avec Karine Le Marchand, qui a généré plus de cinquante ventes à partir d'une seule story. Cette lecture d'ensemble suffit à comprendre l'essentiel de ce que j'ai réalisé.</w:t>
       </w:r>
     </w:p>
     <w:p>
@@ -3258,7 +2964,7 @@
         <w:pStyle w:val="Heading2"/>
       </w:pPr>
       <w:r>
-        <w:t>3.2 Bilan</w:t>
+        <w:t>b. Bilan</w:t>
       </w:r>
     </w:p>
     <w:p>
@@ -3272,7 +2978,7 @@
         <w:t xml:space="preserve">Quelles compétences ai-je développées ? </w:t>
       </w:r>
       <w:r>
-        <w:t>J'ai appris à piloter un projet de communication digitale en planifiant et en coordonnant les tâches à l'aide de Trello et d'un circuit de validation. J'ai développé la capacité à animer des réseaux sociaux et à créer des contenus en produisant régulièrement des posts, des stories et des vidéos courtes adaptés à chaque plateforme. J'ai renforcé ma maîtrise de l'analyse de performance en suivant des indicateurs et en produisant un reporting hebdomadaire. J'ai enfin acquis des compétences e-commerce concrètes en utilisant Shopify pour le site et les fiches produits et Odoo pour les revendeurs.</w:t>
+        <w:t>J'ai appris à piloter un projet de communication digitale en planifiant et en coordonnant les tâches à l'aide de Trello et d'un circuit de validation. J'ai développé la capacité à animer des réseaux sociaux et à créer des contenus, notamment des stories et des Reels vidéo adaptés à chaque plateforme. J'ai renforcé ma maîtrise de l'analyse de performance en suivant des indicateurs et en produisant un reporting hebdomadaire. J'ai enfin acquis des compétences e-commerce concrètes avec Shopify et Odoo.</w:t>
       </w:r>
     </w:p>
     <w:p>
@@ -3286,7 +2992,7 @@
         <w:t xml:space="preserve">Qu'ai-je appris en termes de savoir-être et de posture professionnelle ? </w:t>
       </w:r>
       <w:r>
-        <w:t>J'ai surtout gagné en autonomie. Au début, lorsqu'il fallait répondre à des commentaires négatifs, je demandais systématiquement de l'aide ; avec le temps, j'ai appris à gérer ces messages seule, en gardant le bon ton et en protégeant l'image de la marque. Le reporting m'intimidait et je l'appréhendais chaque semaine, mais à force de le pratiquer, j'ai gagné en aisance pour exposer et défendre mon travail. J'ai aussi appris à décider seule quand la situation l'exigeait et à être force de proposition. Ce sont ces petits pas, répétés semaine après semaine, qui m'ont fait passer d'une posture d'exécutante à une posture de cheffe de projet.</w:t>
+        <w:t>J'ai surtout gagné en autonomie. Au début, lorsqu'il fallait répondre à des commentaires négatifs, je demandais systématiquement de l'aide ; avec le temps, j'ai appris à gérer ces messages seule, en gardant le bon ton. Le reporting m'intimidait, mais à force de le pratiquer, j'ai gagné en aisance pour exposer et défendre mon travail. J'ai aussi appris à décider seule quand la situation l'exigeait et à être force de proposition. Ce sont ces petits pas, répétés semaine après semaine, qui m'ont fait passer d'une posture d'exécutante à une posture de cheffe de projet.</w:t>
       </w:r>
     </w:p>
     <w:p>
@@ -3300,7 +3006,7 @@
         <w:t xml:space="preserve">Mon projet professionnel s'est-il conforté, a-t-il évolué ou est-il remis en question ? </w:t>
       </w:r>
       <w:r>
-        <w:t>Cette expérience a nettement conforté mon projet. Elle m'a fait découvrir le e-commerce, un terrain que je ne connaissais pas et qui me passionne désormais, et elle m'a donné le goût et la confiance du pilotage de projet. À l'issue de mon Bachelor, je souhaite poursuivre en mastère afin d'approfondir mes compétences et, à terme, piloter des projets digitaux de plus grande ampleur.</w:t>
+        <w:t>Cette expérience a nettement conforté mon projet. Elle m'a fait découvrir le e-commerce, un terrain qui me passionne désormais, et elle m'a donné le goût et la confiance du pilotage de projet. À l'issue de mon Bachelor, je souhaite poursuivre en mastère afin d'approfondir mes compétences et, à terme, piloter des projets digitaux de plus grande ampleur.</w:t>
       </w:r>
     </w:p>
     <w:p>
@@ -3313,6 +3019,60 @@
         <w:pStyle w:val="Heading1"/>
       </w:pPr>
       <w:r>
+        <w:t>4. Bibliographie</w:t>
+      </w:r>
+    </w:p>
+    <w:p>
+      <w:pPr>
+        <w:pStyle w:val="ListBullet"/>
+      </w:pPr>
+      <w:r>
+        <w:t>Site officiel de la marque : www.jaivulavierge.com</w:t>
+      </w:r>
+    </w:p>
+    <w:p>
+      <w:pPr>
+        <w:pStyle w:val="ListBullet"/>
+      </w:pPr>
+      <w:r>
+        <w:t>Comptes Instagram, TikTok et Facebook de J'ai vu la Vierge</w:t>
+      </w:r>
+    </w:p>
+    <w:p>
+      <w:pPr>
+        <w:pStyle w:val="ListBullet"/>
+      </w:pPr>
+      <w:r>
+        <w:t>Documentation Shopify et Kiliba (aide en ligne des plateformes)</w:t>
+      </w:r>
+    </w:p>
+    <w:p>
+      <w:pPr>
+        <w:pStyle w:val="ListBullet"/>
+      </w:pPr>
+      <w:r>
+        <w:t>Meta Business Suite et TikTok Analytics (données de performance)</w:t>
+      </w:r>
+    </w:p>
+    <w:p>
+      <w:r>
+        <w:rPr>
+          <w:i/>
+          <w:highlight w:val="yellow"/>
+        </w:rPr>
+        <w:t>[À compléter : ajoutez toute autre source utilisée : articles, études, ouvrages]</w:t>
+      </w:r>
+    </w:p>
+    <w:p>
+      <w:r>
+        <w:br w:type="page"/>
+      </w:r>
+    </w:p>
+    <w:p>
+      <w:pPr>
+        <w:pStyle w:val="Heading1"/>
+      </w:pPr>
+      <w:r>
         <w:t>Annexes</w:t>
       </w:r>
     </w:p>
@@ -3321,7 +3081,7 @@
         <w:jc w:val="both"/>
       </w:pPr>
       <w:r>
-        <w:t>Les annexes rassemblent les éléments concrets qui appuient ce dossier. Insérez ci-dessous vos captures et documents réels.</w:t>
+        <w:t>Les annexes rassemblent les éléments concrets qui appuient ce dossier.</w:t>
       </w:r>
     </w:p>
     <w:p>
@@ -3363,7 +3123,7 @@
         <w:rPr>
           <w:b/>
         </w:rPr>
-        <w:t>Annexe 3 : exemples de publications et de visuels réalisés pour les réseaux sociaux.</w:t>
+        <w:t>Annexe 3 : exemples de publications, de stories et de Reels réalisés.</w:t>
       </w:r>
     </w:p>
     <w:p>
@@ -3414,7 +3174,7 @@
         <w:rPr>
           <w:b/>
         </w:rPr>
-        <w:t>Annexe 6 : extraits de statistiques (réseaux sociaux, site, emailing).</w:t>
+        <w:t>Annexe 6 : extraits de statistiques (réseaux, site, emailing).</w:t>
       </w:r>
     </w:p>
     <w:p>
@@ -3533,6 +3293,17 @@
         <w:rPr>
           <w:b/>
         </w:rPr>
+        <w:t xml:space="preserve">Reel : </w:t>
+      </w:r>
+      <w:r>
+        <w:t>format de vidéo courte sur Instagram.</w:t>
+      </w:r>
+    </w:p>
+    <w:p>
+      <w:r>
+        <w:rPr>
+          <w:b/>
+        </w:rPr>
         <w:t xml:space="preserve">Rétroplanning : </w:t>
       </w:r>
       <w:r>
@@ -3562,17 +3333,6 @@
       </w:r>
     </w:p>
     <w:p>
-      <w:r>
-        <w:rPr>
-          <w:b/>
-        </w:rPr>
-        <w:t xml:space="preserve">Template : </w:t>
-      </w:r>
-      <w:r>
-        <w:t>modèle prêt à l'emploi pour concevoir un email cohérent.</w:t>
-      </w:r>
-    </w:p>
-    <w:p>
       <w:pPr>
         <w:pStyle w:val="Heading2"/>
       </w:pPr>
@@ -3625,15 +3385,7 @@
         <w:pStyle w:val="ListBullet"/>
       </w:pPr>
       <w:r>
-        <w:t>Tableau 5 : Comparaison des solutions d'emailing envisagées</w:t>
-      </w:r>
-    </w:p>
-    <w:p>
-      <w:pPr>
-        <w:pStyle w:val="ListBullet"/>
-      </w:pPr>
-      <w:r>
-        <w:t>Tableau 6 : Rétroplanning simplifié des actions sur l'année</w:t>
+        <w:t>Tableau 5 : Rétroplanning simplifié des actions sur l'année</w:t>
       </w:r>
     </w:p>
     <w:p>
@@ -3649,7 +3401,7 @@
         <w:pStyle w:val="ListBullet"/>
       </w:pPr>
       <w:r>
-        <w:t>Tableau 7 : Les indicateurs de performance suivis</w:t>
+        <w:t>Tableau 6 : Les indicateurs de performance suivis</w:t>
       </w:r>
     </w:p>
     <w:p>
@@ -3657,7 +3409,7 @@
         <w:pStyle w:val="ListBullet"/>
       </w:pPr>
       <w:r>
-        <w:t>Tableau 8 : Résultats avant et après la mise en œuvre</w:t>
+        <w:t>Tableau 7 : Résultats avant et après la mise en œuvre</w:t>
       </w:r>
     </w:p>
     <w:sectPr>

</xml_diff>

<commit_message>
docs(bc3): ajoute la sous-partie "L'environnement technique" sous L'entreprise
Aligne totalement le plan sur le cahier des charges EEMI en ajoutant une
sous-partie dédiée 1.c "L'environnement technique" (outils logiciels et
relations avec prestataires, clients et revendeurs).

Co-Authored-By: Claude Opus 4.8 <noreply@anthropic.com>
Claude-Session: https://claude.ai/code/session_013XZsCkVv1YrHfxt73dcWQ8
</commit_message>
<xml_diff>
--- a/dossier-bc3/Dossier_BC3_EEMI_Estelle_CASTEROT.docx
+++ b/dossier-bc3/Dossier_BC3_EEMI_Estelle_CASTEROT.docx
@@ -1116,6 +1116,132 @@
       </w:pPr>
       <w:r>
         <w:t>Chaque pôle regroupe des métiers complémentaires. La direction assure la création, le design produit et la stratégie globale. Le pôle commercial gère la relation avec les revendeurs et le développement des ventes professionnelles. Le pôle atelier réalise la production, la peinture et la préparation des commandes. Le pôle digital, enfin, porte l'image de la marque et les ventes en ligne, à travers le site e-commerce, les réseaux sociaux et l'emailing. C'est dans ce dernier pôle que s'inscrivait mon poste.</w:t>
+      </w:r>
+    </w:p>
+    <w:p>
+      <w:pPr>
+        <w:pStyle w:val="Heading2"/>
+      </w:pPr>
+      <w:r>
+        <w:t>c. L'environnement technique</w:t>
+      </w:r>
+    </w:p>
+    <w:p>
+      <w:pPr>
+        <w:jc w:val="both"/>
+      </w:pPr>
+      <w:r>
+        <w:t>Sur le plan technique, J'ai vu la Vierge s'appuie sur un écosystème d'outils numériques qui structurent son activité en ligne et sur lesquels reposait une grande partie de mon travail.</w:t>
+      </w:r>
+    </w:p>
+    <w:p>
+      <w:pPr>
+        <w:pStyle w:val="ListBullet"/>
+      </w:pPr>
+      <w:r>
+        <w:rPr>
+          <w:b/>
+        </w:rPr>
+        <w:t xml:space="preserve">Shopify : </w:t>
+      </w:r>
+      <w:r>
+        <w:t>le site e-commerce, les fiches produits et les données de vente.</w:t>
+      </w:r>
+    </w:p>
+    <w:p>
+      <w:pPr>
+        <w:pStyle w:val="ListBullet"/>
+      </w:pPr>
+      <w:r>
+        <w:rPr>
+          <w:b/>
+        </w:rPr>
+        <w:t xml:space="preserve">Odoo : </w:t>
+      </w:r>
+      <w:r>
+        <w:t>la gestion des commandes et de la relation avec les revendeurs professionnels.</w:t>
+      </w:r>
+    </w:p>
+    <w:p>
+      <w:pPr>
+        <w:pStyle w:val="ListBullet"/>
+      </w:pPr>
+      <w:r>
+        <w:rPr>
+          <w:b/>
+        </w:rPr>
+        <w:t xml:space="preserve">Kiliba : </w:t>
+      </w:r>
+      <w:r>
+        <w:t>l'emailing automatisé, piloté par l'intelligence artificielle et intégré à Shopify.</w:t>
+      </w:r>
+    </w:p>
+    <w:p>
+      <w:pPr>
+        <w:pStyle w:val="ListBullet"/>
+      </w:pPr>
+      <w:r>
+        <w:rPr>
+          <w:b/>
+        </w:rPr>
+        <w:t xml:space="preserve">Un studio d'emailing sur mesure : </w:t>
+      </w:r>
+      <w:r>
+        <w:t>pour les communications premium respectant parfaitement l'identité visuelle de la marque.</w:t>
+      </w:r>
+    </w:p>
+    <w:p>
+      <w:pPr>
+        <w:pStyle w:val="ListBullet"/>
+      </w:pPr>
+      <w:r>
+        <w:rPr>
+          <w:b/>
+        </w:rPr>
+        <w:t xml:space="preserve">Trello : </w:t>
+      </w:r>
+      <w:r>
+        <w:t>la planification et le suivi des tâches.</w:t>
+      </w:r>
+    </w:p>
+    <w:p>
+      <w:pPr>
+        <w:pStyle w:val="ListBullet"/>
+      </w:pPr>
+      <w:r>
+        <w:rPr>
+          <w:b/>
+        </w:rPr>
+        <w:t xml:space="preserve">Les outils des plateformes sociales : </w:t>
+      </w:r>
+      <w:r>
+        <w:t>Meta Business Suite pour Instagram et Facebook et les outils natifs de TikTok, pour la programmation et le suivi des publications.</w:t>
+      </w:r>
+    </w:p>
+    <w:p>
+      <w:r>
+        <w:rPr>
+          <w:i/>
+          <w:highlight w:val="yellow"/>
+        </w:rPr>
+        <w:t>[À compléter : ajoutez vos outils de création et de montage vidéo, par exemple Canva, CapCut ou la suite Adobe]</w:t>
+      </w:r>
+    </w:p>
+    <w:p>
+      <w:pPr>
+        <w:jc w:val="both"/>
+      </w:pPr>
+      <w:r>
+        <w:t>Cet environnement technique s'accompagne de relations suivies avec plusieurs acteurs externes. La marque collabore avec ses prestataires, s'adresse à ses clients particuliers par le site et les réseaux sociaux, et anime un large réseau de revendeurs et de partenaires physiques, dont je relayais les opérations sur les canaux digitaux.</w:t>
+      </w:r>
+    </w:p>
+    <w:p>
+      <w:r>
+        <w:rPr>
+          <w:i/>
+          <w:highlight w:val="yellow"/>
+        </w:rPr>
+        <w:t>[À compléter : précisez si vous le souhaitez vos prestataires clés, par exemple la logistique, le transporteur ou d'éventuels prestataires techniques]</w:t>
       </w:r>
     </w:p>
     <w:p>

</xml_diff>

<commit_message>
style(bc3): humanise l'ensemble du texte et fixe Ynov Aix
Réécrit tout le dossier dans une voix plus naturelle et personnelle
d'étudiante, tout en restant professionnel et correct. Renseigne
l'établissement (Ynov Campus Aix-en-Provence) sur la page de garde, l'en-tête
et le pied de page.

Co-Authored-By: Claude Opus 4.8 <noreply@anthropic.com>
Claude-Session: https://claude.ai/code/session_013XZsCkVv1YrHfxt73dcWQ8
</commit_message>
<xml_diff>
--- a/dossier-bc3/Dossier_BC3_EEMI_Estelle_CASTEROT.docx
+++ b/dossier-bc3/Dossier_BC3_EEMI_Estelle_CASTEROT.docx
@@ -13,7 +13,7 @@
           <w:sz w:val="24"/>
           <w:highlight w:val="yellow"/>
         </w:rPr>
-        <w:t>[ Logo J'ai vu la Vierge ]          [ Logo EEMI ]</w:t>
+        <w:t>[ Logo J'ai vu la Vierge ]          [ Logo Ynov ]</w:t>
       </w:r>
     </w:p>
     <w:p/>
@@ -84,6 +84,19 @@
           <w:sz w:val="24"/>
         </w:rPr>
         <w:t>Bachelor 3 Communication, Marketing et Événementiel</w:t>
+      </w:r>
+    </w:p>
+    <w:p>
+      <w:pPr>
+        <w:jc w:val="center"/>
+      </w:pPr>
+      <w:r>
+        <w:rPr>
+          <w:b w:val="0"/>
+          <w:i w:val="0"/>
+          <w:sz w:val="24"/>
+        </w:rPr>
+        <w:t>Ynov Campus Aix-en-Provence</w:t>
       </w:r>
     </w:p>
     <w:p>
@@ -171,20 +184,6 @@
           <w:sz w:val="24"/>
         </w:rPr>
         <w:t>Camille Abela, Responsable de Projet e-commerce</w:t>
-      </w:r>
-    </w:p>
-    <w:p>
-      <w:pPr>
-        <w:jc w:val="center"/>
-      </w:pPr>
-      <w:r>
-        <w:rPr>
-          <w:b w:val="0"/>
-          <w:i/>
-          <w:sz w:val="22"/>
-          <w:highlight w:val="yellow"/>
-        </w:rPr>
-        <w:t>Campus [Ynov Aix-en-Provence / EEMI, à confirmer selon l'établissement]</w:t>
       </w:r>
     </w:p>
     <w:p>
@@ -381,7 +380,7 @@
         <w:jc w:val="both"/>
       </w:pPr>
       <w:r>
-        <w:t>Avant d'entrer dans le vif de ce retour d'expérience, je souhaite adresser mes remerciements à toutes les personnes qui ont rendu cette alternance aussi riche.</w:t>
+        <w:t>Avant de commencer, je tiens à remercier les personnes qui ont fait de cette alternance une année aussi enrichissante.</w:t>
       </w:r>
     </w:p>
     <w:p>
@@ -389,7 +388,7 @@
         <w:jc w:val="both"/>
       </w:pPr>
       <w:r>
-        <w:t>Je remercie tout particulièrement Camille Abela, ma tutrice et Responsable de Projet e-commerce, pour sa confiance, sa disponibilité et l'accompagnement qu'elle m'a offert tout au long de l'année. Ses briefs, ses retours et nos points hebdomadaires m'ont permis de progresser semaine après semaine et de gagner en autonomie sur un métier que je découvrais.</w:t>
+        <w:t>Merci d'abord à Camille Abela, ma tutrice et Responsable de Projet e-commerce. Elle m'a fait confiance dès le début, s'est toujours rendue disponible et m'a accompagnée toute l'année. Grâce à ses briefs, à ses retours et à nos points du lundi, j'ai vraiment senti que je progressais semaine après semaine, sur un métier que je découvrais presque entièrement.</w:t>
       </w:r>
     </w:p>
     <w:p>
@@ -397,7 +396,7 @@
         <w:jc w:val="both"/>
       </w:pPr>
       <w:r>
-        <w:t>Je remercie également Alexandra Cefai, créatrice de la marque J'ai vu la Vierge, ainsi que l'ensemble de l'équipe, qui m'ont accueillie avec bienveillance et m'ont fait confiance sur des sujets à forte visibilité.</w:t>
+        <w:t>Merci aussi à Alexandra Cefai, la créatrice de J'ai vu la Vierge, et à toute l'équipe. Ils m'ont accueillie avec beaucoup de bienveillance et m'ont confié des sujets visibles, ce qui m'a beaucoup responsabilisée.</w:t>
       </w:r>
     </w:p>
     <w:p>
@@ -405,7 +404,7 @@
         <w:jc w:val="both"/>
       </w:pPr>
       <w:r>
-        <w:t>Mes remerciements vont enfin à l'équipe pédagogique et à mon référent de formation, qui m'ont donné les repères méthodologiques nécessaires pour mener à bien mes missions et pour prendre le recul attendu dans ce dossier.</w:t>
+        <w:t>Enfin, merci à l'équipe pédagogique d'Ynov et à mon référent de formation, qui m'ont donné les méthodes nécessaires pour mener mes missions et pour prendre le recul attendu dans ce dossier.</w:t>
       </w:r>
     </w:p>
     <w:p>
@@ -426,7 +425,7 @@
         <w:jc w:val="both"/>
       </w:pPr>
       <w:r>
-        <w:t>J'ai réalisé mon alternance de troisième année de Bachelor Communication, Marketing et Événementiel au sein de la marque J'ai vu la Vierge, selon un rythme de deux semaines en entreprise pour une semaine à l'école. J'y ai occupé le poste de Cheffe de Projet e-commerce, au sein du pôle digital, sous la responsabilité de ma tutrice Camille Abela.</w:t>
+        <w:t>J'ai effectué mon alternance de troisième année de Bachelor Communication, Marketing et Événementiel à Ynov Aix, au sein de la marque J'ai vu la Vierge. Mon rythme était de deux semaines en entreprise pour une semaine à l'école, et j'y occupais le poste de Cheffe de Projet e-commerce, dans le pôle digital, aux côtés de ma tutrice Camille Abela.</w:t>
       </w:r>
     </w:p>
     <w:p>
@@ -434,7 +433,7 @@
         <w:jc w:val="both"/>
       </w:pPr>
       <w:r>
-        <w:t>J'ai choisi cette alternance parce qu'elle correspondait précisément à mon projet professionnel. Je voulais apprendre à piloter des projets digitaux de bout en bout et découvrir le e-commerce, un univers que je connaissais peu et qui me semblait porteur. Rejoindre une marque à l'identité aussi singulière que J'ai vu la Vierge représentait un défi stimulant, à la croisée de la communication, du marketing et de l'événementiel. Cette expérience s'inscrit pleinement dans mon ambition de poursuivre en mastère puis de devenir cheffe de projet.</w:t>
+        <w:t>Si j'ai choisi cette alternance, c'est parce qu'elle collait vraiment à ce que je veux faire plus tard. J'avais envie d'apprendre à gérer des projets digitaux du début à la fin et de découvrir le e-commerce, un univers qui m'attirait mais que je connaissais mal. Et puis rejoindre une marque aussi singulière que J'ai vu la Vierge, c'était un vrai défi, à la croisée de la communication, du marketing et de l'événementiel. Cette année s'inscrit dans mon projet : continuer en mastère, puis devenir cheffe de projet.</w:t>
       </w:r>
     </w:p>
     <w:p>
@@ -442,7 +441,7 @@
         <w:jc w:val="both"/>
       </w:pPr>
       <w:r>
-        <w:t>La marque réinvente la statuette de la Vierge Marie en objet de décoration contemporain, à la rencontre de l'iconographie religieuse, de l'artisanat et de la culture pop. Ce positionnement fait à la fois sa force et sa principale difficulté de communication, car il faut proposer un objet à forte charge symbolique à un public large sans trahir son identité. De ce constat est née la problématique qui guide ce dossier.</w:t>
+        <w:t>J'ai vu la Vierge réinvente la statuette de la Vierge Marie en objet de décoration. C'est une marque à part, entre iconographie religieuse, artisanat et culture pop. Ce positionnement fait toute sa force, mais c'est aussi sa plus grande difficulté en communication : il faut parler d'un objet très symbolique à un large public, sans jamais trahir son esprit. C'est de là qu'est venue la question qui guide ce dossier.</w:t>
       </w:r>
     </w:p>
     <w:p>
@@ -462,7 +461,7 @@
         <w:jc w:val="both"/>
       </w:pPr>
       <w:r>
-        <w:t>Pour y répondre, je présente d'abord l'entreprise, son organisation et son environnement. J'expose ensuite mes missions et responsabilités, puis le projet central de mon alternance, la stratégie de communication digitale, avant de détailler l'ensemble de mes missions. Je termine par un retour d'expérience, une synthèse et un bilan.</w:t>
+        <w:t>Pour y répondre, je commence par présenter l'entreprise, son organisation et ses outils. Je parle ensuite de mon poste et de mes responsabilités, puis du projet qui a occupé le cœur de mon année, la stratégie de communication digitale, avant de détailler chacune de mes missions. Je termine par un retour d'expérience, une synthèse et un bilan.</w:t>
       </w:r>
     </w:p>
     <w:p>
@@ -499,7 +498,7 @@
         <w:jc w:val="both"/>
       </w:pPr>
       <w:r>
-        <w:t>J'ai vu la Vierge est une marque de décoration qui revisite une figure très ancienne, la statuette de la Vierge Marie, pour en faire un objet contemporain, coloré et désirable. Là où l'objet religieux classique reste discret, la marque en fait une pièce de décoration assumée, à la fois spirituelle et pop, avec l'ambition de bousculer les codes de la décoration dévote.</w:t>
+        <w:t>J'ai vu la Vierge est une marque de décoration qui prend une figure très ancienne, la statuette de la Vierge Marie, pour en faire un objet d'aujourd'hui, coloré et désirable. Là où l'objet religieux classique reste sage et discret, la marque en fait une pièce déco assumée, à la fois spirituelle et pop. Son idée de départ, c'est de dépoussiérer les codes de la bondieuserie.</w:t>
       </w:r>
     </w:p>
     <w:p>
@@ -507,7 +506,7 @@
         <w:jc w:val="both"/>
       </w:pPr>
       <w:r>
-        <w:t>La société a été créée en 2018 par Alexandra Cefai, journaliste pendant vingt ans à La Provence, et son conjoint Damien Grauvogel, artiste et designer produit. Le couple tenait auparavant une galerie d'art au pied de Notre-Dame de la Garde, à Marseille. L'idée est née un lendemain de Fashion Week, en imaginant la Bonne Mère vêtue d'une robe rouge ou rose fluo, avec cette question amusée : pourquoi n'aurait-elle pas le droit de s'habiller comme elle le veut ? Le pari était lancé.</w:t>
+        <w:t>La société a été créée en 2018 par Alexandra Cefai, journaliste pendant vingt ans à La Provence, et son conjoint Damien Grauvogel, artiste et designer produit. Avant cela, le couple tenait une galerie d'art au pied de Notre-Dame de la Garde, à Marseille. L'idée de la marque leur est venue un lendemain de Fashion Week, en imaginant la Bonne Mère habillée d'une robe rouge ou rose fluo, avec cette phrase restée célèbre en interne : pourquoi n'aurait-elle pas le droit de s'habiller comme elle veut ? Le pari était lancé.</w:t>
       </w:r>
     </w:p>
     <w:p>
@@ -515,7 +514,7 @@
         <w:jc w:val="both"/>
       </w:pPr>
       <w:r>
-        <w:t>L'aventure a d'abord été familiale. Alexandra s'occupait de la partie commerciale, Damien du design et de la production, et la mère de Damien du conditionnement. Le concept a connu un succès rapide, notamment grâce au salon Maison et Objet, qui a ouvert la marque à l'international. Aujourd'hui, l'entreprise est installée dans le quartier de La Pomme, à Marseille. Quelques chiffres clés résument son développement.</w:t>
+        <w:t>Au début, tout se faisait en famille. Alexandra s'occupait du commercial, Damien du design et de la production, et la maman de Damien du conditionnement. Le succès est venu vite, notamment grâce au salon Maison et Objet, qui a ouvert la marque à l'international. Aujourd'hui, l'entreprise est installée dans le quartier de La Pomme, à Marseille. Quelques chiffres résument bien ce parcours.</w:t>
       </w:r>
     </w:p>
     <w:p>
@@ -529,7 +528,7 @@
         <w:t xml:space="preserve">Statut : </w:t>
       </w:r>
       <w:r>
-        <w:t>PME au statut de SAS, créée en 2018 à Marseille.</w:t>
+        <w:t>PME sous forme de SAS, créée en 2018 à Marseille.</w:t>
       </w:r>
     </w:p>
     <w:p>
@@ -543,7 +542,7 @@
         <w:t xml:space="preserve">Effectif : </w:t>
       </w:r>
       <w:r>
-        <w:t>de 3 salariés à ses débuts à 9 aujourd'hui.</w:t>
+        <w:t>de 3 salariés au départ à 9 aujourd'hui.</w:t>
       </w:r>
     </w:p>
     <w:p>
@@ -587,7 +586,7 @@
         <w:jc w:val="both"/>
       </w:pPr>
       <w:r>
-        <w:t>La marque occupe un positionnement premium et affinitaire : on n'achète pas seulement un objet, on adhère à une histoire et à une esthétique. Elle s'adresse à une clientèle majoritairement féminine, avec un cœur de cible situé entre trente et soixante ans. Pour orienter mes contenus, je me suis appuyée sur un persona type : une femme active et urbaine, attirée par les objets qui racontent une histoire, présente sur Instagram et attachée à l'authenticité d'une marque.</w:t>
+        <w:t>La marque se place sur un segment premium et affinitaire : quand on achète une statuette, on achète surtout une histoire et une esthétique. Sa clientèle est majoritairement féminine, avec un cœur de cible entre trente et soixante ans. Pour écrire mes contenus, je gardais toujours en tête un persona : une femme active et citadine, qui aime les objets qui ont une histoire, qui est présente sur Instagram et qui tient à l'authenticité d'une marque.</w:t>
       </w:r>
     </w:p>
     <w:p>
@@ -604,7 +603,7 @@
         <w:jc w:val="both"/>
       </w:pPr>
       <w:r>
-        <w:t>La distribution repose sur plusieurs canaux complémentaires : le site e-commerce propulsé par Shopify, une plateforme dédiée aux revendeurs sous Odoo, et un réseau de partenaires physiques prestigieux comme Le Printemps, le Mucem, Maison et Objet, Boboboom ou l'Olympique de Marseille, sans oublier des collaborations médiatiques telles que celle menée avec Karine Le Marchand. Sur son marché, la marque évolue face à des concurrents qui exploitent le même imaginaire, notamment Sapristi et Miraculeuse. Ce qui la distingue tient à deux atouts : une présence sur les réseaux sociaux nettement plus dynamique et un réseau de très bons commerçants et partenaires.</w:t>
+        <w:t>Côté distribution, la marque joue sur plusieurs canaux : le site e-commerce sous Shopify, une plateforme revendeurs sous Odoo, et un réseau de partenaires physiques prestigieux comme Le Printemps, le Mucem, Maison et Objet, Boboboom ou l'Olympique de Marseille. À cela s'ajoutent des collaborations médiatiques, comme celle avec Karine Le Marchand. Sur son marché, elle croise quelques concurrents qui jouent sur le même imaginaire, notamment Sapristi et Miraculeuse. Ce qui fait vraiment la différence, ce sont deux choses : une présence beaucoup plus vivante sur les réseaux, et un très bon réseau de commerçants et de partenaires.</w:t>
       </w:r>
     </w:p>
     <w:p>
@@ -626,7 +625,7 @@
         <w:t xml:space="preserve">Environnement externe. </w:t>
       </w:r>
       <w:r>
-        <w:t>J'ai synthétisé l'environnement externe de la marque dans une grille PESTEL, qui passe en revue les grands facteurs qui influencent son activité.</w:t>
+        <w:t>Pour bien situer le contexte, j'ai résumé l'environnement externe de la marque dans une grille PESTEL.</w:t>
       </w:r>
     </w:p>
     <w:tbl>
@@ -817,7 +816,7 @@
               <w:rPr>
                 <w:sz w:val="20"/>
               </w:rPr>
-              <w:t>Attentes croissantes sur l'origine des produits et une fabrication responsable.</w:t>
+              <w:t>Attentes de plus en plus fortes sur l'origine des produits et une fabrication responsable.</w:t>
             </w:r>
           </w:p>
         </w:tc>
@@ -877,7 +876,7 @@
         <w:t xml:space="preserve">Environnement interne et synthèse SWOT. </w:t>
       </w:r>
       <w:r>
-        <w:t>En croisant les forces et faiblesses internes avec les opportunités et menaces externes, j'obtiens la matrice SWOT suivante, qui résume la situation stratégique de la marque.</w:t>
+        <w:t>En croisant tout cela, les forces et les faiblesses internes d'un côté, les opportunités et les menaces externes de l'autre, j'obtiens la matrice SWOT ci-dessous, qui résume assez bien la situation de la marque.</w:t>
       </w:r>
     </w:p>
     <w:tbl>
@@ -1075,7 +1074,7 @@
         <w:jc w:val="both"/>
       </w:pPr>
       <w:r>
-        <w:t>J'ai vu la Vierge est une structure à taille humaine, aujourd'hui composée de neuf salariés, avec un management de proximité dans un esprit encore familial hérité des débuts de la marque. L'organisation se répartit en quatre pôles : la direction, portée par Alexandra Cefai et Damien Grauvogel, le pôle digital auquel j'étais rattachée, le pôle commercial et le pôle atelier, où sont réalisées la peinture et la préparation des commandes. L'organigramme ci-dessous situe ma position au sein de cet ensemble.</w:t>
+        <w:t>J'ai vu la Vierge reste une petite structure, neuf salariés aujourd'hui, avec un management de proximité et un esprit encore un peu familial, hérité des débuts. L'entreprise s'organise en quatre pôles : la direction, portée par Alexandra Cefai et Damien Grauvogel, le pôle digital dans lequel je travaillais, le pôle commercial et le pôle atelier, où l'on peint les pièces et où l'on prépare les commandes. L'organigramme ci-dessous montre où je me situais.</w:t>
       </w:r>
     </w:p>
     <w:p>
@@ -1115,7 +1114,7 @@
         <w:jc w:val="both"/>
       </w:pPr>
       <w:r>
-        <w:t>Chaque pôle regroupe des métiers complémentaires. La direction assure la création, le design produit et la stratégie globale. Le pôle commercial gère la relation avec les revendeurs et le développement des ventes professionnelles. Le pôle atelier réalise la production, la peinture et la préparation des commandes. Le pôle digital, enfin, porte l'image de la marque et les ventes en ligne, à travers le site e-commerce, les réseaux sociaux et l'emailing. C'est dans ce dernier pôle que s'inscrivait mon poste.</w:t>
+        <w:t>Chaque pôle a ses métiers. La direction gère la création, le design produit et la stratégie. Le pôle commercial s'occupe des revendeurs et des ventes professionnelles. Le pôle atelier fabrique, peint et prépare les commandes. Et le pôle digital, le mien, porte l'image de la marque et les ventes en ligne, à travers le site, les réseaux sociaux et l'emailing.</w:t>
       </w:r>
     </w:p>
     <w:p>
@@ -1131,7 +1130,7 @@
         <w:jc w:val="both"/>
       </w:pPr>
       <w:r>
-        <w:t>Sur le plan technique, J'ai vu la Vierge s'appuie sur un écosystème d'outils numériques qui structurent son activité en ligne et sur lesquels reposait une grande partie de mon travail.</w:t>
+        <w:t>D'un point de vue technique, mon travail reposait sur plusieurs outils, qui forment l'environnement numérique de la marque.</w:t>
       </w:r>
     </w:p>
     <w:p>
@@ -1159,7 +1158,7 @@
         <w:t xml:space="preserve">Odoo : </w:t>
       </w:r>
       <w:r>
-        <w:t>la gestion des commandes et de la relation avec les revendeurs professionnels.</w:t>
+        <w:t>la gestion des commandes et de la relation avec les revendeurs.</w:t>
       </w:r>
     </w:p>
     <w:p>
@@ -1173,7 +1172,7 @@
         <w:t xml:space="preserve">Kiliba : </w:t>
       </w:r>
       <w:r>
-        <w:t>l'emailing automatisé, piloté par l'intelligence artificielle et intégré à Shopify.</w:t>
+        <w:t>l'emailing automatisé, piloté par l'intelligence artificielle et branché sur Shopify.</w:t>
       </w:r>
     </w:p>
     <w:p>
@@ -1187,7 +1186,7 @@
         <w:t xml:space="preserve">Un studio d'emailing sur mesure : </w:t>
       </w:r>
       <w:r>
-        <w:t>pour les communications premium respectant parfaitement l'identité visuelle de la marque.</w:t>
+        <w:t>pour les envois premium qui doivent coller parfaitement à l'identité de la marque.</w:t>
       </w:r>
     </w:p>
     <w:p>
@@ -1201,7 +1200,7 @@
         <w:t xml:space="preserve">Trello : </w:t>
       </w:r>
       <w:r>
-        <w:t>la planification et le suivi des tâches.</w:t>
+        <w:t>la planification et le suivi de mes tâches.</w:t>
       </w:r>
     </w:p>
     <w:p>
@@ -1212,10 +1211,10 @@
         <w:rPr>
           <w:b/>
         </w:rPr>
-        <w:t xml:space="preserve">Les outils des plateformes sociales : </w:t>
+        <w:t xml:space="preserve">Les outils des réseaux : </w:t>
       </w:r>
       <w:r>
-        <w:t>Meta Business Suite pour Instagram et Facebook et les outils natifs de TikTok, pour la programmation et le suivi des publications.</w:t>
+        <w:t>Meta Business Suite pour Instagram et Facebook, et les outils de TikTok, pour programmer et suivre les publications.</w:t>
       </w:r>
     </w:p>
     <w:p>
@@ -1232,7 +1231,7 @@
         <w:jc w:val="both"/>
       </w:pPr>
       <w:r>
-        <w:t>Cet environnement technique s'accompagne de relations suivies avec plusieurs acteurs externes. La marque collabore avec ses prestataires, s'adresse à ses clients particuliers par le site et les réseaux sociaux, et anime un large réseau de revendeurs et de partenaires physiques, dont je relayais les opérations sur les canaux digitaux.</w:t>
+        <w:t>À côté de ces outils, la marque entretient des relations régulières avec plusieurs acteurs : ses prestataires, ses clients particuliers qu'elle touche par le site et les réseaux, et son grand réseau de revendeurs et de partenaires physiques, dont je relayais les opérations en ligne.</w:t>
       </w:r>
     </w:p>
     <w:p>
@@ -1241,7 +1240,7 @@
           <w:i/>
           <w:highlight w:val="yellow"/>
         </w:rPr>
-        <w:t>[À compléter : précisez si vous le souhaitez vos prestataires clés, par exemple la logistique, le transporteur ou d'éventuels prestataires techniques]</w:t>
+        <w:t>[À compléter : précisez si vous le souhaitez vos prestataires clés, par exemple la logistique ou le transporteur]</w:t>
       </w:r>
     </w:p>
     <w:p>
@@ -1270,7 +1269,7 @@
         <w:jc w:val="both"/>
       </w:pPr>
       <w:r>
-        <w:t>En tant que Cheffe de Projet e-commerce au sein du pôle digital, j'occupais un rôle transversal, entre communication, création de contenu et commerce en ligne. Mes interlocuteurs hiérarchiques étaient ma tutrice Camille Abela, qui me briefait et validait mes contenus, et Alexandra Cefai, la créatrice, pour tout ce qui touchait à l'identité visuelle. J'avais la responsabilité de faire vivre la marque au quotidien sur ses canaux digitaux, avec un vrai niveau d'autonomie sur la proposition et la production des contenus, dans le respect des validations. Pour mener à bien ces missions, je disposais des accès aux plateformes sociales, au site Shopify, à Odoo, à l'outil d'emailing et à Trello pour l'organisation.</w:t>
+        <w:t>Comme Cheffe de Projet e-commerce dans le pôle digital, j'avais un rôle assez transversal, entre communication, création et vente en ligne. Mes deux interlocutrices principales étaient Camille, ma tutrice, qui me briefait et validait mes contenus, et Alexandra, la créatrice, dès qu'il s'agissait de l'identité visuelle. Concrètement, j'étais responsable de faire vivre la marque au quotidien sur ses canaux digitaux. J'avais une vraie liberté pour proposer et produire les contenus, du moment que je respectais les validations. Pour cela, j'avais accès aux réseaux, au site Shopify, à Odoo, à l'outil d'emailing et à Trello.</w:t>
       </w:r>
     </w:p>
     <w:p>
@@ -1286,7 +1285,7 @@
         <w:jc w:val="both"/>
       </w:pPr>
       <w:r>
-        <w:t>Mon poste m'amenait à interagir avec l'ensemble des services de l'entreprise. Avec la direction, j'échangeais sur l'identité de la marque et la validation des contenus les plus sensibles. Avec le pôle commercial, je coordonnais la mise en avant des partenaires et des revendeurs sur les réseaux. Avec le pôle atelier, je récupérais les informations produits nécessaires aux fiches et aux visuels. Enfin, j'étais en relation directe avec les clients, à qui je répondais par mail et par la messagerie d'Instagram et de Facebook. Notre organisation reposait sur des rituels réguliers : un brief chaque lundi pour cadrer les priorités, un point hebdomadaire de suivi et un reporting transmis chaque lundi.</w:t>
+        <w:t>Mon poste me faisait travailler avec presque tous les services. Avec la direction, on parlait de l'identité de la marque et de la validation des contenus les plus délicats. Avec le pôle commercial, je mettais en avant les partenaires et les revendeurs sur les réseaux. Avec l'atelier, je récupérais les informations produits dont j'avais besoin pour les fiches et les visuels. Et j'étais en contact direct avec les clients, à qui je répondais par mail et en messagerie sur Instagram et Facebook. Tout cela était rythmé par des rituels simples : un brief le lundi pour fixer les priorités, un point de suivi dans la semaine, et un reporting chaque lundi.</w:t>
       </w:r>
     </w:p>
     <w:p>
@@ -1310,7 +1309,7 @@
         <w:jc w:val="both"/>
       </w:pPr>
       <w:r>
-        <w:t>Au démarrage de mon alternance, la marque possédait déjà une belle communauté, mais très inégale d'un réseau à l'autre, et une visibilité qui se convertissait mal en ventes. La sensibilité de l'image ajoutait une contrainte, car il ne suffisait pas de communiquer plus, il fallait communiquer juste. Ce constat a fait naître la problématique du projet : développer la visibilité et les ventes en ligne grâce à une stratégie de communication digitale cohérente, tout en préservant une image singulière et sensible.</w:t>
+        <w:t>Quand je suis arrivée, la marque avait déjà une jolie communauté, mais très déséquilibrée d'un réseau à l'autre, et une visibilité qui se transformait mal en ventes. La sensibilité de l'image compliquait encore les choses : il ne suffisait pas de communiquer plus, il fallait communiquer juste. C'est ce constat qui a fait naître la question du projet : comment développer la visibilité et les ventes en ligne avec une communication digitale cohérente, sans jamais abîmer une image aussi particulière ?</w:t>
       </w:r>
     </w:p>
     <w:p>
@@ -1326,7 +1325,7 @@
         <w:jc w:val="both"/>
       </w:pPr>
       <w:r>
-        <w:t>La cible principale correspond au persona décrit plus haut, cette femme de trente à soixante ans sensible à l'objet qui a du sens, présente sur les réseaux sociaux et sensible à l'authenticité. À côté de cette cible particulier, la marque adresse aussi une cible professionnelle, celle des revendeurs, que le pôle commercial anime.</w:t>
+        <w:t>La cible principale, c'est le persona dont je parlais plus haut : cette femme de trente à soixante ans, sensible aux objets qui ont du sens, active sur les réseaux et attachée à l'authenticité. À côté, la marque vise aussi une cible professionnelle, les revendeurs, mais c'est le pôle commercial qui s'en occupe.</w:t>
       </w:r>
     </w:p>
     <w:p>
@@ -1342,7 +1341,7 @@
         <w:jc w:val="both"/>
       </w:pPr>
       <w:r>
-        <w:t>À partir de ces cibles, la marque m'avait fixé des objectifs clairs, qui ont servi de boussole tout au long du projet.</w:t>
+        <w:t>À partir de ces cibles, on m'avait fixé des objectifs clairs, qui m'ont servi de fil rouge toute l'année.</w:t>
       </w:r>
     </w:p>
     <w:p>
@@ -1390,7 +1389,7 @@
         <w:jc w:val="both"/>
       </w:pPr>
       <w:r>
-        <w:t>Avant d'agir, j'ai dressé un état des lieux chiffré de notre présence digitale.</w:t>
+        <w:t>Avant de me lancer, j'ai fait un état des lieux chiffré de notre présence en ligne.</w:t>
       </w:r>
     </w:p>
     <w:p>
@@ -1432,7 +1431,7 @@
         <w:t xml:space="preserve">TikTok : </w:t>
       </w:r>
       <w:r>
-        <w:t>seulement 28 abonnés, un compte tout juste lancé et donc une vraie marge de progression.</w:t>
+        <w:t>seulement 28 abonnés, un compte tout juste lancé, donc tout était à construire.</w:t>
       </w:r>
     </w:p>
     <w:p>
@@ -1446,7 +1445,7 @@
         <w:t xml:space="preserve">Emailing : </w:t>
       </w:r>
       <w:r>
-        <w:t>une base d'environ 1 200 contacts clients et des newsletters déjà envoyées régulièrement, un socle solide mais encore à optimiser.</w:t>
+        <w:t>une base d'environ 1 200 contacts et des newsletters déjà envoyées régulièrement, un bon point de départ mais encore à optimiser.</w:t>
       </w:r>
     </w:p>
     <w:p>
@@ -1454,7 +1453,7 @@
         <w:jc w:val="both"/>
       </w:pPr>
       <w:r>
-        <w:t>Cet audit confirmait une visibilité très concentrée sur Instagram et un fort potentiel inexploité, notamment sur la vidéo courte avec TikTok et sur la relation client par email.</w:t>
+        <w:t>Cet audit confirmait ce que je pressentais : une visibilité très concentrée sur Instagram, et beaucoup de potentiel encore inexploité, surtout du côté de la vidéo courte sur TikTok et de la relation client par email.</w:t>
       </w:r>
     </w:p>
     <w:p>
@@ -1478,7 +1477,7 @@
         <w:jc w:val="both"/>
       </w:pPr>
       <w:r>
-        <w:t>Je me suis inspirée des marques de décoration et de lifestyle qui réussissent sur les réseaux, en analysant leurs formats, leur ton et leur rythme de publication, puis en les confrontant à l'identité singulière de J'ai vu la Vierge pour ne garder que ce qui lui ressemblait.</w:t>
+        <w:t>Je me suis inspirée des marques de déco et de lifestyle qui marchent bien sur les réseaux. J'ai regardé leurs formats, leur ton et leur rythme de publication, puis j'ai confronté tout cela à l'identité de J'ai vu la Vierge pour ne garder que ce qui lui ressemblait vraiment.</w:t>
       </w:r>
     </w:p>
     <w:p>
@@ -1494,7 +1493,7 @@
         <w:jc w:val="both"/>
       </w:pPr>
       <w:r>
-        <w:t>J'ai raisonné autour de trois scénarios possibles, que j'ai comparés avant de trancher.</w:t>
+        <w:t>J'ai réfléchi à trois scénarios possibles, que j'ai comparés avant de choisir.</w:t>
       </w:r>
     </w:p>
     <w:tbl>
@@ -1823,7 +1822,7 @@
         <w:jc w:val="both"/>
       </w:pPr>
       <w:r>
-        <w:t>J'ai retenu le scénario C, la stratégie mixte, car c'est le seul qui répond à l'ensemble des objectifs à la fois. À l'intérieur de ce scénario, le levier emailing posait une question d'outil, que j'ai tranchée en privilégiant Kiliba pour le ciblage par intelligence artificielle et son intégration à Shopify, tout en développant un studio d'emailing sur mesure pour les communications premium.</w:t>
+        <w:t>J'ai retenu le scénario C, la stratégie mixte, parce que c'est le seul qui répond à tous les objectifs en même temps. Restait la question de l'outil d'emailing : j'ai choisi Kiliba pour son ciblage par intelligence artificielle et son intégration à Shopify, tout en gardant un studio d'emailing sur mesure pour les envois les plus soignés.</w:t>
       </w:r>
     </w:p>
     <w:p>
@@ -1839,7 +1838,7 @@
         <w:jc w:val="both"/>
       </w:pPr>
       <w:r>
-        <w:t>Pour piloter la stratégie, mon outil central était Trello, sur lequel je planifiais toutes les tâches dans une logique kanban, en suivant chaque contenu de l'idée jusqu'à la publication. Chaque création suivait un circuit de validation en deux temps, par la créatrice et par ma tutrice, ce qui garantissait la cohérence avec l'identité de la marque.</w:t>
+        <w:t>Pour tout piloter, mon outil central était Trello. J'y planifiais mes tâches en colonnes, façon kanban, et je suivais chaque contenu de l'idée jusqu'à la publication. Rien ne partait sans validation : chaque création passait entre les mains de la créatrice et de ma tutrice, ce qui garantissait qu'on restait toujours fidèle à l'image de la marque.</w:t>
       </w:r>
     </w:p>
     <w:p>
@@ -1855,7 +1854,7 @@
         <w:jc w:val="both"/>
       </w:pPr>
       <w:r>
-        <w:t>J'ai construit une ligne éditoriale fidèle au ton de la marque, en équilibrant plusieurs familles de contenus : les contenus produits qui donnent envie d'acheter, les coulisses qui créent de la proximité, les temps forts qui font l'événement, et les formats spontanés inspirés des tendances qui captent de nouveaux publics.</w:t>
+        <w:t>J'ai construit une ligne éditoriale fidèle au ton de la marque, en alternant plusieurs types de contenus : les contenus produits qui donnent envie, les coulisses qui créent de la proximité, les temps forts qui font l'événement, et des formats plus spontanés, calés sur les tendances, pour aller chercher de nouvelles personnes.</w:t>
       </w:r>
     </w:p>
     <w:p>
@@ -1871,7 +1870,7 @@
         <w:jc w:val="both"/>
       </w:pPr>
       <w:r>
-        <w:t>La diffusion suivait un planning réfléchi, avec une cadence régulière de publications adaptée à chaque plateforme et concentrée sur les temps forts à plus fort impact. Les actions se sont déployées progressivement sur l'année, selon le rétroplanning ci-dessous.</w:t>
+        <w:t>Côté diffusion, je suivais un planning, avec une cadence régulière adaptée à chaque plateforme et un effort concentré sur les temps forts. Les actions se sont mises en place petit à petit sur l'année, comme le montre le rétroplanning ci-dessous.</w:t>
       </w:r>
     </w:p>
     <w:tbl>
@@ -2214,7 +2213,7 @@
         <w:jc w:val="both"/>
       </w:pPr>
       <w:r>
-        <w:t>Le projet s'appuyait sur un environnement technique complet : Shopify pour le site, les fiches produits et les données de vente, Odoo pour les revendeurs, Kiliba pour l'emailing automatisé, un studio d'emailing sur mesure pour les communications premium, Trello pour la gestion de projet, et les outils natifs d'Instagram, TikTok et Facebook pour la programmation et le suivi.</w:t>
+        <w:t>Le projet s'appuyait sur tout un ensemble d'outils : Shopify pour le site, les fiches produits et les ventes, Odoo pour les revendeurs, Kiliba pour l'emailing automatisé, un studio d'emailing sur mesure pour les envois premium, Trello pour l'organisation, et les outils d'Instagram, de TikTok et de Facebook pour programmer et suivre les publications.</w:t>
       </w:r>
     </w:p>
     <w:p>
@@ -2223,7 +2222,7 @@
           <w:i/>
           <w:highlight w:val="yellow"/>
         </w:rPr>
-        <w:t>[À compléter : ajoutez vos outils de création de visuels et de montage vidéo, par exemple Canva, CapCut ou la suite Adobe]</w:t>
+        <w:t>[À compléter : ajoutez vos outils de création et de montage vidéo, par exemple Canva, CapCut ou la suite Adobe]</w:t>
       </w:r>
     </w:p>
     <w:p>
@@ -2239,7 +2238,7 @@
         <w:jc w:val="both"/>
       </w:pPr>
       <w:r>
-        <w:t>J'ai travaillé une palette de formats variés pour couvrir tout le parcours d'attention : les posts pour installer l'univers, les carrousels pour raconter et informer, les stories pour l'instantané et l'interaction, et les vidéos courtes pour la portée.</w:t>
+        <w:t>J'ai utilisé une palette de formats assez large pour capter l'attention à chaque étape : des posts pour poser l'univers, des carrousels pour raconter, des stories pour l'instantané et l'interaction, et des vidéos courtes pour la portée.</w:t>
       </w:r>
     </w:p>
     <w:p>
@@ -2253,7 +2252,7 @@
         <w:t xml:space="preserve">Zoom sur les vidéos. </w:t>
       </w:r>
       <w:r>
-        <w:t>Les stories et les Reels vidéo ont été un axe fort de mon travail. Ce sont les formats qui offrent aujourd'hui la meilleure portée organique et qui permettent de toucher de nouveaux publics. J'ai conçu, tourné et monté ces vidéos en m'appuyant sur les tendances, ce qui a soutenu la croissance de la marque, en particulier sur TikTok, où tout restait à construire.</w:t>
+        <w:t>Les stories et les Reels vidéo ont vraiment été un gros morceau de mon travail. Ce sont les formats qui touchent le plus de monde en ce moment, et ceux qui permettent d'aller chercher de nouvelles personnes. Je les imaginais, je les tournais et je les montais moi-même, en m'appuyant sur les tendances. C'est surtout cela qui a fait décoller la marque sur TikTok, où tout était à construire.</w:t>
       </w:r>
     </w:p>
     <w:p>
@@ -2269,7 +2268,7 @@
         <w:jc w:val="both"/>
       </w:pPr>
       <w:r>
-        <w:t>Pour piloter la stratégie, j'ai suivi des indicateurs répartis sur tout le parcours client, de la notoriété jusqu'à la fidélisation.</w:t>
+        <w:t>Pour piloter tout cela, je suivais des indicateurs à chaque étape du parcours, de la notoriété jusqu'à la fidélité.</w:t>
       </w:r>
     </w:p>
     <w:tbl>
@@ -2908,7 +2907,7 @@
           <w:i/>
           <w:highlight w:val="yellow"/>
         </w:rPr>
-        <w:t>[À compléter : commentez vos chiffres réels une fois complétés : quelles actions ont le mieux fonctionné]</w:t>
+        <w:t>[À compléter : commentez vos chiffres réels une fois complétés : ce qui a le mieux marché et pourquoi]</w:t>
       </w:r>
     </w:p>
     <w:p>
@@ -2924,7 +2923,7 @@
         <w:jc w:val="both"/>
       </w:pPr>
       <w:r>
-        <w:t>Au delà du pilotage de la stratégie, mon alternance s'est traduite par des missions concrètes et quotidiennes, que je détaille ici.</w:t>
+        <w:t>Au delà de la stratégie, mon année s'est surtout traduite par des missions concrètes, tous les jours. Les voici en détail.</w:t>
       </w:r>
     </w:p>
     <w:p>
@@ -2940,7 +2939,7 @@
         <w:jc w:val="both"/>
       </w:pPr>
       <w:r>
-        <w:t>J'animais au quotidien les comptes Instagram, TikTok et Facebook de la marque. Cela comprenait la programmation et la publication des contenus, mais aussi tout le travail de communauté : répondre aux commentaires et aux messages, entretenir la relation avec les abonnés et faire remonter leurs retours. Cette présence régulière est ce qui maintient le lien vivant entre la marque et son public.</w:t>
+        <w:t>J'animais au quotidien les comptes Instagram, TikTok et Facebook. Cela voulait dire programmer et publier les contenus, bien sûr, mais aussi tout le travail de communauté : répondre aux commentaires et aux messages, garder le lien avec les abonnés, faire remonter ce qu'ils disaient. C'est ce travail de tous les jours qui fait qu'une marque reste vivante.</w:t>
       </w:r>
     </w:p>
     <w:p>
@@ -2956,7 +2955,7 @@
         <w:jc w:val="both"/>
       </w:pPr>
       <w:r>
-        <w:t>La création de stories et de Reels vidéo a occupé une place importante dans mes missions. Je concevais les idées, je tournais et je montais ces vidéos, en m'inspirant des tendances tout en respectant l'univers de la marque. J'ai particulièrement investi ce format court car c'est celui qui génère le plus de portée et qui a permis de faire connaître la marque à de nouveaux publics, notamment sur TikTok.</w:t>
+        <w:t>La création de stories et de Reels vidéo a pris une grande place dans mes journées. J'avais les idées, je tournais, je montais, en m'inspirant des tendances tout en restant fidèle à l'univers de la marque. J'ai beaucoup misé sur ce format court, parce que c'est celui qui rapporte le plus de visibilité et qui nous a fait connaître de nouvelles personnes, surtout sur TikTok.</w:t>
       </w:r>
     </w:p>
     <w:p>
@@ -2972,7 +2971,7 @@
         <w:jc w:val="both"/>
       </w:pPr>
       <w:r>
-        <w:t>Je participais aux shootings des produits et je préparais les visuels, en soignant la mise en scène et la cohérence avec l'identité de la marque. Chaque visuel était ensuite décliné selon les codes de chaque plateforme, afin d'être toujours au bon format et au bon endroit.</w:t>
+        <w:t>Je participais aux shootings produits et je préparais les visuels, en soignant la mise en scène et la cohérence avec la marque. Ensuite, chaque visuel était décliné selon les codes de chaque plateforme, pour être toujours au bon format, au bon endroit.</w:t>
       </w:r>
     </w:p>
     <w:p>
@@ -2988,7 +2987,7 @@
         <w:jc w:val="both"/>
       </w:pPr>
       <w:r>
-        <w:t>J'assurais la mise à jour du site e-commerce et la rédaction des fiches produits. L'enjeu était double : présenter chaque référence de façon claire et désirable pour donner envie d'acheter, et soigner la rédaction pour servir à la fois l'image de la marque et le référencement du site.</w:t>
+        <w:t>Je m'occupais aussi de la mise à jour du site et de la rédaction des fiches produits. Là, l'enjeu était double : présenter chaque produit de façon claire et donner envie de l'acheter, mais aussi soigner les textes pour servir à la fois l'image de la marque et le référencement du site.</w:t>
       </w:r>
     </w:p>
     <w:p>
@@ -3004,7 +3003,7 @@
         <w:jc w:val="both"/>
       </w:pPr>
       <w:r>
-        <w:t>Je participais à la conception et à l'envoi des campagnes email et des newsletters adressées à notre base de contacts. Ce canal, que la marque maîtrise totalement, servait à entretenir la relation client, à annoncer les nouveautés et les temps forts et à soutenir les ventes du site.</w:t>
+        <w:t>Je participais à la création et à l'envoi des campagnes email et des newsletters adressées à notre base de contacts. C'est un canal que la marque maîtrise complètement, et il servait à garder le lien avec les clients, à annoncer les nouveautés et les temps forts, et à soutenir les ventes du site.</w:t>
       </w:r>
     </w:p>
     <w:p>
@@ -3020,7 +3019,7 @@
         <w:jc w:val="both"/>
       </w:pPr>
       <w:r>
-        <w:t>Chaque semaine, je réalisais un reporting des performances, en suivant les indicateurs des réseaux, du site et de l'emailing. Cette mission m'a appris à mesurer l'impact réel de chaque action, à en tirer des enseignements et à ajuster la stratégie en conséquence.</w:t>
+        <w:t>Enfin, chaque semaine, je faisais un reporting des performances, en suivant les chiffres des réseaux, du site et de l'emailing. C'est une mission qui m'a appris à mesurer l'impact réel de ce que je faisais, à en tirer des leçons et à ajuster la suite.</w:t>
       </w:r>
     </w:p>
     <w:p>
@@ -3036,7 +3035,7 @@
         <w:jc w:val="both"/>
       </w:pPr>
       <w:r>
-        <w:t>La principale difficulté a été la sensibilité de l'image de la marque, illustrée par l'hésitation de l'Olympique de Marseille, qui m'a appris à communiquer avec justesse. Une autre difficulté, plus quotidienne, a été d'apprendre à jongler entre des tâches très différentes dans une même journée, ce que j'ai structuré grâce à la planification et aux rituels de la semaine.</w:t>
+        <w:t>La plus grosse difficulté, cela a été la sensibilité de l'image de la marque. L'hésitation de l'Olympique de Marseille m'a bien fait comprendre qu'il fallait communiquer avec beaucoup de tact. Une autre difficulté, plus quotidienne, a été d'apprendre à jongler entre des tâches très différentes dans une même journée. Au début, cela me dispersait un peu, et c'est l'organisation et les rituels de la semaine qui m'ont aidée à tenir le cap.</w:t>
       </w:r>
     </w:p>
     <w:p>
@@ -3053,7 +3052,7 @@
         <w:jc w:val="both"/>
       </w:pPr>
       <w:r>
-        <w:t>Ma valeur ajoutée a été d'apporter à la marque une animation digitale régulière et cohérente, de contribuer à des temps forts comme la collaboration Karine Le Marchand, qui a généré plus de cinquante ventes à partir d'une seule story, et de faire monter en puissance des canaux encore peu exploités comme TikTok et l'emailing. Les principaux axes d'amélioration que j'identifie sont de structurer plus tôt le levier de l'emailing et la collecte des données clients, et de mettre en place dès le départ un tableau de suivi des indicateurs plus complet.</w:t>
+        <w:t>Ma valeur ajoutée, je la vois surtout dans trois choses : avoir apporté à la marque une animation digitale régulière et cohérente, avoir participé à des temps forts comme la collaboration avec Karine Le Marchand, qui a généré plus de cinquante ventes avec une seule story, et avoir fait décoller des canaux encore peu exploités comme TikTok et l'emailing. Si je devais m'améliorer, je m'attaquerais plus tôt à l'emailing et à la collecte des données clients, et je mettrais en place dès le début un vrai tableau de suivi des indicateurs.</w:t>
       </w:r>
     </w:p>
     <w:p>
@@ -3082,7 +3081,7 @@
         <w:jc w:val="both"/>
       </w:pPr>
       <w:r>
-        <w:t>Durant mon alternance chez J'ai vu la Vierge, j'ai piloté la stratégie de communication digitale d'une marque à l'identité forte et sensible. Partant d'une visibilité concentrée sur Instagram et d'une conversion insuffisante, j'ai animé au quotidien Instagram, TikTok et Facebook, produit les contenus, les stories, les Reels et les fiches produits, participé à l'emailing et assuré le reporting. J'ai comparé plusieurs scénarios avant de retenir une stratégie mixte, et j'ai contribué à des opérations marquantes comme la collaboration avec Karine Le Marchand, qui a généré plus de cinquante ventes à partir d'une seule story. Cette lecture d'ensemble suffit à comprendre l'essentiel de ce que j'ai réalisé.</w:t>
+        <w:t>Pendant mon alternance chez J'ai vu la Vierge, j'ai piloté la stratégie de communication digitale d'une marque à l'identité forte et sensible. Au départ, la visibilité était concentrée sur Instagram et se transformait mal en ventes. J'ai animé au quotidien Instagram, TikTok et Facebook, produit les contenus, les stories, les Reels et les fiches produits, participé à l'emailing et assuré le reporting. J'ai comparé plusieurs scénarios avant de choisir une stratégie mixte, et j'ai participé à des opérations marquantes comme la collaboration avec Karine Le Marchand, qui a rapporté plus de cinquante ventes à partir d'une seule story. En lisant simplement cette synthèse, on comprend l'essentiel de ce que j'ai fait et de ce que cela a donné.</w:t>
       </w:r>
     </w:p>
     <w:p>
@@ -3104,7 +3103,7 @@
         <w:t xml:space="preserve">Quelles compétences ai-je développées ? </w:t>
       </w:r>
       <w:r>
-        <w:t>J'ai appris à piloter un projet de communication digitale en planifiant et en coordonnant les tâches à l'aide de Trello et d'un circuit de validation. J'ai développé la capacité à animer des réseaux sociaux et à créer des contenus, notamment des stories et des Reels vidéo adaptés à chaque plateforme. J'ai renforcé ma maîtrise de l'analyse de performance en suivant des indicateurs et en produisant un reporting hebdomadaire. J'ai enfin acquis des compétences e-commerce concrètes avec Shopify et Odoo.</w:t>
+        <w:t>J'ai appris à piloter un projet de communication digitale, en planifiant et en coordonnant les tâches avec Trello et un circuit de validation. J'ai développé ma capacité à animer des réseaux sociaux et à créer des contenus, en particulier des stories et des Reels vidéo pensés pour chaque plateforme. J'ai gagné en aisance sur l'analyse des performances, en suivant des indicateurs et en faisant un reporting chaque semaine. Et j'ai acquis des compétences e-commerce très concrètes avec Shopify et Odoo.</w:t>
       </w:r>
     </w:p>
     <w:p>
@@ -3118,7 +3117,7 @@
         <w:t xml:space="preserve">Qu'ai-je appris en termes de savoir-être et de posture professionnelle ? </w:t>
       </w:r>
       <w:r>
-        <w:t>J'ai surtout gagné en autonomie. Au début, lorsqu'il fallait répondre à des commentaires négatifs, je demandais systématiquement de l'aide ; avec le temps, j'ai appris à gérer ces messages seule, en gardant le bon ton. Le reporting m'intimidait, mais à force de le pratiquer, j'ai gagné en aisance pour exposer et défendre mon travail. J'ai aussi appris à décider seule quand la situation l'exigeait et à être force de proposition. Ce sont ces petits pas, répétés semaine après semaine, qui m'ont fait passer d'une posture d'exécutante à une posture de cheffe de projet.</w:t>
+        <w:t>C'est surtout en autonomie que j'ai le plus grandi. Au début, dès qu'il fallait répondre à un commentaire négatif, je demandais de l'aide, parce que ce n'était pas évident. Petit à petit, j'ai appris à gérer ces messages toute seule, en gardant le bon ton. Le reporting aussi m'impressionnait, et je l'appréhendais chaque semaine, mais à force de le faire, j'ai fini par être à l'aise pour présenter et défendre mon travail. J'ai aussi appris à décider seule quand il le fallait et à proposer mes propres idées. Ce sont tous ces petits pas, semaine après semaine, qui m'ont fait passer d'une posture d'exécutante à une posture de cheffe de projet.</w:t>
       </w:r>
     </w:p>
     <w:p>
@@ -3132,7 +3131,7 @@
         <w:t xml:space="preserve">Mon projet professionnel s'est-il conforté, a-t-il évolué ou est-il remis en question ? </w:t>
       </w:r>
       <w:r>
-        <w:t>Cette expérience a nettement conforté mon projet. Elle m'a fait découvrir le e-commerce, un terrain qui me passionne désormais, et elle m'a donné le goût et la confiance du pilotage de projet. À l'issue de mon Bachelor, je souhaite poursuivre en mastère afin d'approfondir mes compétences et, à terme, piloter des projets digitaux de plus grande ampleur.</w:t>
+        <w:t>Cette expérience a vraiment conforté mon projet. Elle m'a fait découvrir le e-commerce, un domaine qui me passionne aujourd'hui, et elle m'a donné le goût et la confiance de piloter des projets. Après mon Bachelor, je veux continuer en mastère pour approfondir tout cela, et à terme piloter des projets digitaux plus ambitieux.</w:t>
       </w:r>
     </w:p>
     <w:p>
@@ -3169,7 +3168,7 @@
         <w:pStyle w:val="ListBullet"/>
       </w:pPr>
       <w:r>
-        <w:t>Documentation Shopify et Kiliba (aide en ligne des plateformes)</w:t>
+        <w:t>Documentation en ligne de Shopify et de Kiliba</w:t>
       </w:r>
     </w:p>
     <w:p>
@@ -3562,7 +3561,7 @@
       </w:tabs>
     </w:pPr>
     <w:r>
-      <w:t>Année 2025 / 2026</w:t>
+      <w:t>Bachelor 3 - 2025 / 2026</w:t>
       <w:tab/>
       <w:t>Estelle Casterot</w:t>
       <w:tab/>
@@ -3588,7 +3587,7 @@
         <w:sz w:val="18"/>
         <w:highlight w:val="yellow"/>
       </w:rPr>
-      <w:t>[ Logo entreprise ]        Estelle Casterot        [ Logo EEMI ]</w:t>
+      <w:t>[ Logo entreprise ]        Estelle Casterot        [ Logo Ynov ]</w:t>
     </w:r>
   </w:p>
 </w:hdr>

</xml_diff>

<commit_message>
docs(bc3): intègre les outils de création (Canva, CapCut, Photoshop, Illustrator)
Ajoute la phrase sur les outils de création et de retouche photo dans
"L'environnement technique" et dans "Outils utilisés", dans le ton humanisé.

Co-Authored-By: Claude Opus 4.8 <noreply@anthropic.com>
Claude-Session: https://claude.ai/code/session_013XZsCkVv1YrHfxt73dcWQ8
</commit_message>
<xml_diff>
--- a/dossier-bc3/Dossier_BC3_EEMI_Estelle_CASTEROT.docx
+++ b/dossier-bc3/Dossier_BC3_EEMI_Estelle_CASTEROT.docx
@@ -1218,12 +1218,11 @@
       </w:r>
     </w:p>
     <w:p>
+      <w:pPr>
+        <w:jc w:val="both"/>
+      </w:pPr>
       <w:r>
-        <w:rPr>
-          <w:i/>
-          <w:highlight w:val="yellow"/>
-        </w:rPr>
-        <w:t>[À compléter : ajoutez vos outils de création et de montage vidéo, par exemple Canva, CapCut ou la suite Adobe]</w:t>
+        <w:t>Je travaillais aussi avec plusieurs outils de création selon les besoins : Canva pour les visuels et les mises en page, CapCut pour le montage de mes stories et de mes Reels vidéo, et surtout Photoshop et Illustrator, sur lesquels je retouchais mes photographies pour qu'elles collent parfaitement à l'univers de la marque.</w:t>
       </w:r>
     </w:p>
     <w:p>
@@ -2217,12 +2216,11 @@
       </w:r>
     </w:p>
     <w:p>
+      <w:pPr>
+        <w:jc w:val="both"/>
+      </w:pPr>
       <w:r>
-        <w:rPr>
-          <w:i/>
-          <w:highlight w:val="yellow"/>
-        </w:rPr>
-        <w:t>[À compléter : ajoutez vos outils de création et de montage vidéo, par exemple Canva, CapCut ou la suite Adobe]</w:t>
+        <w:t>À cela s'ajoutaient mes outils de création : Canva pour les visuels, CapCut pour le montage de mes stories et de mes Reels, et Photoshop et Illustrator pour retoucher mes photographies.</w:t>
       </w:r>
     </w:p>
     <w:p>

</xml_diff>